<commit_message>
Match Chapter 6 to the student PDF, with [13] only in 6.6.
Keep Tables 6.1–6.4 and Figure 6.1; drop the extra tables added earlier.

Co-authored-by: omkeluskar <omkeluskar@users.noreply.github.com>
</commit_message>
<xml_diff>
--- a/cep-iot-bus-stop/chapters/Chapter_6_Community_Deployment_and_Impact_Assessment.docx
+++ b/cep-iot-bus-stop/chapters/Chapter_6_Community_Deployment_and_Impact_Assessment.docx
@@ -4,7 +4,7 @@
   <w:body>
     <w:p>
       <w:pPr>
-        <w:spacing w:before="120" w:after="80" w:line="360" w:lineRule="exact"/>
+        <w:spacing w:before="120" w:after="40" w:line="360" w:lineRule="exact"/>
         <w:jc w:val="center"/>
       </w:pPr>
       <w:r>
@@ -14,7 +14,7 @@
           <w:i w:val="0"/>
           <w:sz w:val="32"/>
         </w:rPr>
-        <w:t>CHAPTER 6</w:t>
+        <w:t>CHAPTER 6: COMMUNITY DEPLOYMENT AND</w:t>
       </w:r>
     </w:p>
     <w:p>
@@ -27,9 +27,9 @@
           <w:rFonts w:ascii="Times New Roman" w:hAnsi="Times New Roman" w:eastAsia="Times New Roman"/>
           <w:b/>
           <w:i w:val="0"/>
-          <w:sz w:val="28"/>
+          <w:sz w:val="32"/>
         </w:rPr>
-        <w:t>COMMUNITY DEPLOYMENT AND IMPACT ASSESSMENT</w:t>
+        <w:t>IMPACT ASSESSMENT</w:t>
       </w:r>
     </w:p>
     <w:p>
@@ -109,461 +109,6 @@
     </w:p>
     <w:p>
       <w:pPr>
-        <w:spacing w:before="160" w:after="120" w:line="280" w:lineRule="exact"/>
-        <w:jc w:val="center"/>
-      </w:pPr>
-      <w:r>
-        <w:rPr>
-          <w:rFonts w:ascii="Times New Roman" w:hAnsi="Times New Roman" w:eastAsia="Times New Roman"/>
-          <w:b/>
-          <w:i w:val="0"/>
-          <w:sz w:val="22"/>
-        </w:rPr>
-        <w:t>Table 6.1: Beneficiary Profile</w:t>
-      </w:r>
-    </w:p>
-    <w:tbl>
-      <w:tblPr>
-        <w:tblStyle w:val="TableGrid"/>
-        <w:tblW w:type="auto" w:w="0"/>
-        <w:jc w:val="center"/>
-        <w:tblLook w:firstColumn="1" w:firstRow="1" w:lastColumn="0" w:lastRow="0" w:noHBand="0" w:noVBand="1" w:val="04A0"/>
-      </w:tblPr>
-      <w:tblGrid>
-        <w:gridCol w:w="3120"/>
-        <w:gridCol w:w="3120"/>
-        <w:gridCol w:w="3120"/>
-      </w:tblGrid>
-      <w:tr>
-        <w:tc>
-          <w:tcPr>
-            <w:tcW w:type="dxa" w:w="3120"/>
-            <w:shd w:fill="1F4E79" w:val="clear"/>
-          </w:tcPr>
-          <w:p>
-            <w:pPr>
-              <w:spacing w:before="40" w:after="40" w:line="240" w:lineRule="exact"/>
-              <w:jc w:val="center"/>
-            </w:pPr>
-            <w:r/>
-            <w:r>
-              <w:rPr>
-                <w:rFonts w:ascii="Times New Roman" w:hAnsi="Times New Roman" w:eastAsia="Times New Roman"/>
-                <w:b/>
-                <w:i w:val="0"/>
-                <w:color w:val="FFFFFF"/>
-                <w:sz w:val="18"/>
-              </w:rPr>
-              <w:t>Beneficiary</w:t>
-            </w:r>
-          </w:p>
-        </w:tc>
-        <w:tc>
-          <w:tcPr>
-            <w:tcW w:type="dxa" w:w="3120"/>
-            <w:shd w:fill="1F4E79" w:val="clear"/>
-          </w:tcPr>
-          <w:p>
-            <w:pPr>
-              <w:spacing w:before="40" w:after="40" w:line="240" w:lineRule="exact"/>
-              <w:jc w:val="center"/>
-            </w:pPr>
-            <w:r/>
-            <w:r>
-              <w:rPr>
-                <w:rFonts w:ascii="Times New Roman" w:hAnsi="Times New Roman" w:eastAsia="Times New Roman"/>
-                <w:b/>
-                <w:i w:val="0"/>
-                <w:color w:val="FFFFFF"/>
-                <w:sz w:val="18"/>
-              </w:rPr>
-              <w:t>Need</w:t>
-            </w:r>
-          </w:p>
-        </w:tc>
-        <w:tc>
-          <w:tcPr>
-            <w:tcW w:type="dxa" w:w="3120"/>
-            <w:shd w:fill="1F4E79" w:val="clear"/>
-          </w:tcPr>
-          <w:p>
-            <w:pPr>
-              <w:spacing w:before="40" w:after="40" w:line="240" w:lineRule="exact"/>
-              <w:jc w:val="center"/>
-            </w:pPr>
-            <w:r/>
-            <w:r>
-              <w:rPr>
-                <w:rFonts w:ascii="Times New Roman" w:hAnsi="Times New Roman" w:eastAsia="Times New Roman"/>
-                <w:b/>
-                <w:i w:val="0"/>
-                <w:color w:val="FFFFFF"/>
-                <w:sz w:val="18"/>
-              </w:rPr>
-              <w:t>System response</w:t>
-            </w:r>
-          </w:p>
-        </w:tc>
-      </w:tr>
-      <w:tr>
-        <w:tc>
-          <w:tcPr>
-            <w:tcW w:type="dxa" w:w="3120"/>
-            <w:shd w:fill="FFFFFF" w:val="clear"/>
-          </w:tcPr>
-          <w:p>
-            <w:pPr>
-              <w:spacing w:before="40" w:after="40" w:line="240" w:lineRule="exact"/>
-              <w:jc w:val="left"/>
-            </w:pPr>
-            <w:r/>
-            <w:r>
-              <w:rPr>
-                <w:rFonts w:ascii="Times New Roman" w:hAnsi="Times New Roman" w:eastAsia="Times New Roman"/>
-                <w:b w:val="0"/>
-                <w:i w:val="0"/>
-                <w:color w:val="000000"/>
-                <w:sz w:val="18"/>
-              </w:rPr>
-              <w:t>Daily commuters</w:t>
-            </w:r>
-          </w:p>
-        </w:tc>
-        <w:tc>
-          <w:tcPr>
-            <w:tcW w:type="dxa" w:w="3120"/>
-            <w:shd w:fill="FFFFFF" w:val="clear"/>
-          </w:tcPr>
-          <w:p>
-            <w:pPr>
-              <w:spacing w:before="40" w:after="40" w:line="240" w:lineRule="exact"/>
-              <w:jc w:val="left"/>
-            </w:pPr>
-            <w:r/>
-            <w:r>
-              <w:rPr>
-                <w:rFonts w:ascii="Times New Roman" w:hAnsi="Times New Roman" w:eastAsia="Times New Roman"/>
-                <w:b w:val="0"/>
-                <w:i w:val="0"/>
-                <w:color w:val="000000"/>
-                <w:sz w:val="18"/>
-              </w:rPr>
-              <w:t>Glanceable crowding status without a mobile application</w:t>
-            </w:r>
-          </w:p>
-        </w:tc>
-        <w:tc>
-          <w:tcPr>
-            <w:tcW w:type="dxa" w:w="3120"/>
-            <w:shd w:fill="FFFFFF" w:val="clear"/>
-          </w:tcPr>
-          <w:p>
-            <w:pPr>
-              <w:spacing w:before="40" w:after="40" w:line="240" w:lineRule="exact"/>
-              <w:jc w:val="left"/>
-            </w:pPr>
-            <w:r/>
-            <w:r>
-              <w:rPr>
-                <w:rFonts w:ascii="Times New Roman" w:hAnsi="Times New Roman" w:eastAsia="Times New Roman"/>
-                <w:b w:val="0"/>
-                <w:i w:val="0"/>
-                <w:color w:val="000000"/>
-                <w:sz w:val="18"/>
-              </w:rPr>
-              <w:t>Red and green LED indicators at the stop</w:t>
-            </w:r>
-          </w:p>
-        </w:tc>
-      </w:tr>
-      <w:tr>
-        <w:tc>
-          <w:tcPr>
-            <w:tcW w:type="dxa" w:w="3120"/>
-            <w:shd w:fill="F2F2F2" w:val="clear"/>
-          </w:tcPr>
-          <w:p>
-            <w:pPr>
-              <w:spacing w:before="40" w:after="40" w:line="240" w:lineRule="exact"/>
-              <w:jc w:val="left"/>
-            </w:pPr>
-            <w:r/>
-            <w:r>
-              <w:rPr>
-                <w:rFonts w:ascii="Times New Roman" w:hAnsi="Times New Roman" w:eastAsia="Times New Roman"/>
-                <w:b w:val="0"/>
-                <w:i w:val="0"/>
-                <w:color w:val="000000"/>
-                <w:sz w:val="18"/>
-              </w:rPr>
-              <w:t>Transit / depot staff</w:t>
-            </w:r>
-          </w:p>
-        </w:tc>
-        <w:tc>
-          <w:tcPr>
-            <w:tcW w:type="dxa" w:w="3120"/>
-            <w:shd w:fill="F2F2F2" w:val="clear"/>
-          </w:tcPr>
-          <w:p>
-            <w:pPr>
-              <w:spacing w:before="40" w:after="40" w:line="240" w:lineRule="exact"/>
-              <w:jc w:val="left"/>
-            </w:pPr>
-            <w:r/>
-            <w:r>
-              <w:rPr>
-                <w:rFonts w:ascii="Times New Roman" w:hAnsi="Times New Roman" w:eastAsia="Times New Roman"/>
-                <w:b w:val="0"/>
-                <w:i w:val="0"/>
-                <w:color w:val="000000"/>
-                <w:sz w:val="18"/>
-              </w:rPr>
-              <w:t>Remote risk indication for dispatch decisions</w:t>
-            </w:r>
-          </w:p>
-        </w:tc>
-        <w:tc>
-          <w:tcPr>
-            <w:tcW w:type="dxa" w:w="3120"/>
-            <w:shd w:fill="F2F2F2" w:val="clear"/>
-          </w:tcPr>
-          <w:p>
-            <w:pPr>
-              <w:spacing w:before="40" w:after="40" w:line="240" w:lineRule="exact"/>
-              <w:jc w:val="left"/>
-            </w:pPr>
-            <w:r/>
-            <w:r>
-              <w:rPr>
-                <w:rFonts w:ascii="Times New Roman" w:hAnsi="Times New Roman" w:eastAsia="Times New Roman"/>
-                <w:b w:val="0"/>
-                <w:i w:val="0"/>
-                <w:color w:val="000000"/>
-                <w:sz w:val="18"/>
-              </w:rPr>
-              <w:t>Blynk dashboard and Telegram alerts</w:t>
-            </w:r>
-          </w:p>
-        </w:tc>
-      </w:tr>
-      <w:tr>
-        <w:tc>
-          <w:tcPr>
-            <w:tcW w:type="dxa" w:w="3120"/>
-            <w:shd w:fill="FFFFFF" w:val="clear"/>
-          </w:tcPr>
-          <w:p>
-            <w:pPr>
-              <w:spacing w:before="40" w:after="40" w:line="240" w:lineRule="exact"/>
-              <w:jc w:val="left"/>
-            </w:pPr>
-            <w:r/>
-            <w:r>
-              <w:rPr>
-                <w:rFonts w:ascii="Times New Roman" w:hAnsi="Times New Roman" w:eastAsia="Times New Roman"/>
-                <w:b w:val="0"/>
-                <w:i w:val="0"/>
-                <w:color w:val="000000"/>
-                <w:sz w:val="18"/>
-              </w:rPr>
-              <w:t>Depot administrators</w:t>
-            </w:r>
-          </w:p>
-        </w:tc>
-        <w:tc>
-          <w:tcPr>
-            <w:tcW w:type="dxa" w:w="3120"/>
-            <w:shd w:fill="FFFFFF" w:val="clear"/>
-          </w:tcPr>
-          <w:p>
-            <w:pPr>
-              <w:spacing w:before="40" w:after="40" w:line="240" w:lineRule="exact"/>
-              <w:jc w:val="left"/>
-            </w:pPr>
-            <w:r/>
-            <w:r>
-              <w:rPr>
-                <w:rFonts w:ascii="Times New Roman" w:hAnsi="Times New Roman" w:eastAsia="Times New Roman"/>
-                <w:b w:val="0"/>
-                <w:i w:val="0"/>
-                <w:color w:val="000000"/>
-                <w:sz w:val="18"/>
-              </w:rPr>
-              <w:t>Low-cost, low-maintenance solution with no subscription</w:t>
-            </w:r>
-          </w:p>
-        </w:tc>
-        <w:tc>
-          <w:tcPr>
-            <w:tcW w:type="dxa" w:w="3120"/>
-            <w:shd w:fill="FFFFFF" w:val="clear"/>
-          </w:tcPr>
-          <w:p>
-            <w:pPr>
-              <w:spacing w:before="40" w:after="40" w:line="240" w:lineRule="exact"/>
-              <w:jc w:val="left"/>
-            </w:pPr>
-            <w:r/>
-            <w:r>
-              <w:rPr>
-                <w:rFonts w:ascii="Times New Roman" w:hAnsi="Times New Roman" w:eastAsia="Times New Roman"/>
-                <w:b w:val="0"/>
-                <w:i w:val="0"/>
-                <w:color w:val="000000"/>
-                <w:sz w:val="18"/>
-              </w:rPr>
-              <w:t>Hardware under ₹1,500 and free-tier APIs</w:t>
-            </w:r>
-          </w:p>
-        </w:tc>
-      </w:tr>
-      <w:tr>
-        <w:tc>
-          <w:tcPr>
-            <w:tcW w:type="dxa" w:w="3120"/>
-            <w:shd w:fill="F2F2F2" w:val="clear"/>
-          </w:tcPr>
-          <w:p>
-            <w:pPr>
-              <w:spacing w:before="40" w:after="40" w:line="240" w:lineRule="exact"/>
-              <w:jc w:val="left"/>
-            </w:pPr>
-            <w:r/>
-            <w:r>
-              <w:rPr>
-                <w:rFonts w:ascii="Times New Roman" w:hAnsi="Times New Roman" w:eastAsia="Times New Roman"/>
-                <w:b w:val="0"/>
-                <w:i w:val="0"/>
-                <w:color w:val="000000"/>
-                <w:sz w:val="18"/>
-              </w:rPr>
-              <w:t>Field technicians</w:t>
-            </w:r>
-          </w:p>
-        </w:tc>
-        <w:tc>
-          <w:tcPr>
-            <w:tcW w:type="dxa" w:w="3120"/>
-            <w:shd w:fill="F2F2F2" w:val="clear"/>
-          </w:tcPr>
-          <w:p>
-            <w:pPr>
-              <w:spacing w:before="40" w:after="40" w:line="240" w:lineRule="exact"/>
-              <w:jc w:val="left"/>
-            </w:pPr>
-            <w:r/>
-            <w:r>
-              <w:rPr>
-                <w:rFonts w:ascii="Times New Roman" w:hAnsi="Times New Roman" w:eastAsia="Times New Roman"/>
-                <w:b w:val="0"/>
-                <w:i w:val="0"/>
-                <w:color w:val="000000"/>
-                <w:sz w:val="18"/>
-              </w:rPr>
-              <w:t>Modular hardware that is easy to replace</w:t>
-            </w:r>
-          </w:p>
-        </w:tc>
-        <w:tc>
-          <w:tcPr>
-            <w:tcW w:type="dxa" w:w="3120"/>
-            <w:shd w:fill="F2F2F2" w:val="clear"/>
-          </w:tcPr>
-          <w:p>
-            <w:pPr>
-              <w:spacing w:before="40" w:after="40" w:line="240" w:lineRule="exact"/>
-              <w:jc w:val="left"/>
-            </w:pPr>
-            <w:r/>
-            <w:r>
-              <w:rPr>
-                <w:rFonts w:ascii="Times New Roman" w:hAnsi="Times New Roman" w:eastAsia="Times New Roman"/>
-                <w:b w:val="0"/>
-                <w:i w:val="0"/>
-                <w:color w:val="000000"/>
-                <w:sz w:val="18"/>
-              </w:rPr>
-              <w:t>ESP32 with I2C/GPIO on a 3.3 V rail</w:t>
-            </w:r>
-          </w:p>
-        </w:tc>
-      </w:tr>
-      <w:tr>
-        <w:tc>
-          <w:tcPr>
-            <w:tcW w:type="dxa" w:w="3120"/>
-            <w:shd w:fill="FFFFFF" w:val="clear"/>
-          </w:tcPr>
-          <w:p>
-            <w:pPr>
-              <w:spacing w:before="40" w:after="40" w:line="240" w:lineRule="exact"/>
-              <w:jc w:val="left"/>
-            </w:pPr>
-            <w:r/>
-            <w:r>
-              <w:rPr>
-                <w:rFonts w:ascii="Times New Roman" w:hAnsi="Times New Roman" w:eastAsia="Times New Roman"/>
-                <w:b w:val="0"/>
-                <w:i w:val="0"/>
-                <w:color w:val="000000"/>
-                <w:sz w:val="18"/>
-              </w:rPr>
-              <w:t>Academic evaluators</w:t>
-            </w:r>
-          </w:p>
-        </w:tc>
-        <w:tc>
-          <w:tcPr>
-            <w:tcW w:type="dxa" w:w="3120"/>
-            <w:shd w:fill="FFFFFF" w:val="clear"/>
-          </w:tcPr>
-          <w:p>
-            <w:pPr>
-              <w:spacing w:before="40" w:after="40" w:line="240" w:lineRule="exact"/>
-              <w:jc w:val="left"/>
-            </w:pPr>
-            <w:r/>
-            <w:r>
-              <w:rPr>
-                <w:rFonts w:ascii="Times New Roman" w:hAnsi="Times New Roman" w:eastAsia="Times New Roman"/>
-                <w:b w:val="0"/>
-                <w:i w:val="0"/>
-                <w:color w:val="000000"/>
-                <w:sz w:val="18"/>
-              </w:rPr>
-              <w:t>Documented IoT and machine-learning prototype</w:t>
-            </w:r>
-          </w:p>
-        </w:tc>
-        <w:tc>
-          <w:tcPr>
-            <w:tcW w:type="dxa" w:w="3120"/>
-            <w:shd w:fill="FFFFFF" w:val="clear"/>
-          </w:tcPr>
-          <w:p>
-            <w:pPr>
-              <w:spacing w:before="40" w:after="40" w:line="240" w:lineRule="exact"/>
-              <w:jc w:val="left"/>
-            </w:pPr>
-            <w:r/>
-            <w:r>
-              <w:rPr>
-                <w:rFonts w:ascii="Times New Roman" w:hAnsi="Times New Roman" w:eastAsia="Times New Roman"/>
-                <w:b w:val="0"/>
-                <w:i w:val="0"/>
-                <w:color w:val="000000"/>
-                <w:sz w:val="18"/>
-              </w:rPr>
-              <w:t>Locked formula, pin map, CSV log, and CEP report</w:t>
-            </w:r>
-          </w:p>
-        </w:tc>
-      </w:tr>
-    </w:tbl>
-    <w:p/>
-    <w:p>
-      <w:pPr>
         <w:spacing w:before="280" w:after="160" w:line="320" w:lineRule="exact"/>
         <w:jc w:val="left"/>
       </w:pPr>
@@ -594,390 +139,6 @@
     </w:p>
     <w:p>
       <w:pPr>
-        <w:spacing w:before="160" w:after="120" w:line="280" w:lineRule="exact"/>
-        <w:jc w:val="center"/>
-      </w:pPr>
-      <w:r>
-        <w:rPr>
-          <w:rFonts w:ascii="Times New Roman" w:hAnsi="Times New Roman" w:eastAsia="Times New Roman"/>
-          <w:b/>
-          <w:i w:val="0"/>
-          <w:sz w:val="22"/>
-        </w:rPr>
-        <w:t>Table 6.2: Community Engagement Activities</w:t>
-      </w:r>
-    </w:p>
-    <w:tbl>
-      <w:tblPr>
-        <w:tblStyle w:val="TableGrid"/>
-        <w:tblW w:type="auto" w:w="0"/>
-        <w:jc w:val="center"/>
-        <w:tblLook w:firstColumn="1" w:firstRow="1" w:lastColumn="0" w:lastRow="0" w:noHBand="0" w:noVBand="1" w:val="04A0"/>
-      </w:tblPr>
-      <w:tblGrid>
-        <w:gridCol w:w="3120"/>
-        <w:gridCol w:w="3120"/>
-        <w:gridCol w:w="3120"/>
-      </w:tblGrid>
-      <w:tr>
-        <w:tc>
-          <w:tcPr>
-            <w:tcW w:type="dxa" w:w="3120"/>
-            <w:shd w:fill="1F4E79" w:val="clear"/>
-          </w:tcPr>
-          <w:p>
-            <w:pPr>
-              <w:spacing w:before="40" w:after="40" w:line="240" w:lineRule="exact"/>
-              <w:jc w:val="center"/>
-            </w:pPr>
-            <w:r/>
-            <w:r>
-              <w:rPr>
-                <w:rFonts w:ascii="Times New Roman" w:hAnsi="Times New Roman" w:eastAsia="Times New Roman"/>
-                <w:b/>
-                <w:i w:val="0"/>
-                <w:color w:val="FFFFFF"/>
-                <w:sz w:val="18"/>
-              </w:rPr>
-              <w:t>Activity</w:t>
-            </w:r>
-          </w:p>
-        </w:tc>
-        <w:tc>
-          <w:tcPr>
-            <w:tcW w:type="dxa" w:w="3120"/>
-            <w:shd w:fill="1F4E79" w:val="clear"/>
-          </w:tcPr>
-          <w:p>
-            <w:pPr>
-              <w:spacing w:before="40" w:after="40" w:line="240" w:lineRule="exact"/>
-              <w:jc w:val="center"/>
-            </w:pPr>
-            <w:r/>
-            <w:r>
-              <w:rPr>
-                <w:rFonts w:ascii="Times New Roman" w:hAnsi="Times New Roman" w:eastAsia="Times New Roman"/>
-                <w:b/>
-                <w:i w:val="0"/>
-                <w:color w:val="FFFFFF"/>
-                <w:sz w:val="18"/>
-              </w:rPr>
-              <w:t>Participants / setting</w:t>
-            </w:r>
-          </w:p>
-        </w:tc>
-        <w:tc>
-          <w:tcPr>
-            <w:tcW w:type="dxa" w:w="3120"/>
-            <w:shd w:fill="1F4E79" w:val="clear"/>
-          </w:tcPr>
-          <w:p>
-            <w:pPr>
-              <w:spacing w:before="40" w:after="40" w:line="240" w:lineRule="exact"/>
-              <w:jc w:val="center"/>
-            </w:pPr>
-            <w:r/>
-            <w:r>
-              <w:rPr>
-                <w:rFonts w:ascii="Times New Roman" w:hAnsi="Times New Roman" w:eastAsia="Times New Roman"/>
-                <w:b/>
-                <w:i w:val="0"/>
-                <w:color w:val="FFFFFF"/>
-                <w:sz w:val="18"/>
-              </w:rPr>
-              <w:t>Outcome for the design</w:t>
-            </w:r>
-          </w:p>
-        </w:tc>
-      </w:tr>
-      <w:tr>
-        <w:tc>
-          <w:tcPr>
-            <w:tcW w:type="dxa" w:w="3120"/>
-            <w:shd w:fill="FFFFFF" w:val="clear"/>
-          </w:tcPr>
-          <w:p>
-            <w:pPr>
-              <w:spacing w:before="40" w:after="40" w:line="240" w:lineRule="exact"/>
-              <w:jc w:val="left"/>
-            </w:pPr>
-            <w:r/>
-            <w:r>
-              <w:rPr>
-                <w:rFonts w:ascii="Times New Roman" w:hAnsi="Times New Roman" w:eastAsia="Times New Roman"/>
-                <w:b w:val="0"/>
-                <w:i w:val="0"/>
-                <w:color w:val="000000"/>
-                <w:sz w:val="18"/>
-              </w:rPr>
-              <w:t>Direct observation</w:t>
-            </w:r>
-          </w:p>
-        </w:tc>
-        <w:tc>
-          <w:tcPr>
-            <w:tcW w:type="dxa" w:w="3120"/>
-            <w:shd w:fill="FFFFFF" w:val="clear"/>
-          </w:tcPr>
-          <w:p>
-            <w:pPr>
-              <w:spacing w:before="40" w:after="40" w:line="240" w:lineRule="exact"/>
-              <w:jc w:val="left"/>
-            </w:pPr>
-            <w:r/>
-            <w:r>
-              <w:rPr>
-                <w:rFonts w:ascii="Times New Roman" w:hAnsi="Times New Roman" w:eastAsia="Times New Roman"/>
-                <w:b w:val="0"/>
-                <w:i w:val="0"/>
-                <w:color w:val="000000"/>
-                <w:sz w:val="18"/>
-              </w:rPr>
-              <w:t>Route 326 boarding edge, morning and evening peaks</w:t>
-            </w:r>
-          </w:p>
-        </w:tc>
-        <w:tc>
-          <w:tcPr>
-            <w:tcW w:type="dxa" w:w="3120"/>
-            <w:shd w:fill="FFFFFF" w:val="clear"/>
-          </w:tcPr>
-          <w:p>
-            <w:pPr>
-              <w:spacing w:before="40" w:after="40" w:line="240" w:lineRule="exact"/>
-              <w:jc w:val="left"/>
-            </w:pPr>
-            <w:r/>
-            <w:r>
-              <w:rPr>
-                <w:rFonts w:ascii="Times New Roman" w:hAnsi="Times New Roman" w:eastAsia="Times New Roman"/>
-                <w:b w:val="0"/>
-                <w:i w:val="0"/>
-                <w:color w:val="000000"/>
-                <w:sz w:val="18"/>
-              </w:rPr>
-              <w:t>Confirmed reactive crowding and the need for automated sensing and alerts</w:t>
-            </w:r>
-          </w:p>
-        </w:tc>
-      </w:tr>
-      <w:tr>
-        <w:tc>
-          <w:tcPr>
-            <w:tcW w:type="dxa" w:w="3120"/>
-            <w:shd w:fill="F2F2F2" w:val="clear"/>
-          </w:tcPr>
-          <w:p>
-            <w:pPr>
-              <w:spacing w:before="40" w:after="40" w:line="240" w:lineRule="exact"/>
-              <w:jc w:val="left"/>
-            </w:pPr>
-            <w:r/>
-            <w:r>
-              <w:rPr>
-                <w:rFonts w:ascii="Times New Roman" w:hAnsi="Times New Roman" w:eastAsia="Times New Roman"/>
-                <w:b w:val="0"/>
-                <w:i w:val="0"/>
-                <w:color w:val="000000"/>
-                <w:sz w:val="18"/>
-              </w:rPr>
-              <w:t>Commuter survey</w:t>
-            </w:r>
-          </w:p>
-        </w:tc>
-        <w:tc>
-          <w:tcPr>
-            <w:tcW w:type="dxa" w:w="3120"/>
-            <w:shd w:fill="F2F2F2" w:val="clear"/>
-          </w:tcPr>
-          <w:p>
-            <w:pPr>
-              <w:spacing w:before="40" w:after="40" w:line="240" w:lineRule="exact"/>
-              <w:jc w:val="left"/>
-            </w:pPr>
-            <w:r/>
-            <w:r>
-              <w:rPr>
-                <w:rFonts w:ascii="Times New Roman" w:hAnsi="Times New Roman" w:eastAsia="Times New Roman"/>
-                <w:b w:val="0"/>
-                <w:i w:val="0"/>
-                <w:color w:val="000000"/>
-                <w:sz w:val="18"/>
-              </w:rPr>
-              <w:t>25 regular BEST commuters around Dindoshi</w:t>
-            </w:r>
-          </w:p>
-        </w:tc>
-        <w:tc>
-          <w:tcPr>
-            <w:tcW w:type="dxa" w:w="3120"/>
-            <w:shd w:fill="F2F2F2" w:val="clear"/>
-          </w:tcPr>
-          <w:p>
-            <w:pPr>
-              <w:spacing w:before="40" w:after="40" w:line="240" w:lineRule="exact"/>
-              <w:jc w:val="left"/>
-            </w:pPr>
-            <w:r/>
-            <w:r>
-              <w:rPr>
-                <w:rFonts w:ascii="Times New Roman" w:hAnsi="Times New Roman" w:eastAsia="Times New Roman"/>
-                <w:b w:val="0"/>
-                <w:i w:val="0"/>
-                <w:color w:val="000000"/>
-                <w:sz w:val="18"/>
-              </w:rPr>
-              <w:t>On-site LEDs, fast alerts, and subtract-not-reset count behaviour</w:t>
-            </w:r>
-          </w:p>
-        </w:tc>
-      </w:tr>
-      <w:tr>
-        <w:tc>
-          <w:tcPr>
-            <w:tcW w:type="dxa" w:w="3120"/>
-            <w:shd w:fill="FFFFFF" w:val="clear"/>
-          </w:tcPr>
-          <w:p>
-            <w:pPr>
-              <w:spacing w:before="40" w:after="40" w:line="240" w:lineRule="exact"/>
-              <w:jc w:val="left"/>
-            </w:pPr>
-            <w:r/>
-            <w:r>
-              <w:rPr>
-                <w:rFonts w:ascii="Times New Roman" w:hAnsi="Times New Roman" w:eastAsia="Times New Roman"/>
-                <w:b w:val="0"/>
-                <w:i w:val="0"/>
-                <w:color w:val="000000"/>
-                <w:sz w:val="18"/>
-              </w:rPr>
-              <w:t>Staff interviews</w:t>
-            </w:r>
-          </w:p>
-        </w:tc>
-        <w:tc>
-          <w:tcPr>
-            <w:tcW w:type="dxa" w:w="3120"/>
-            <w:shd w:fill="FFFFFF" w:val="clear"/>
-          </w:tcPr>
-          <w:p>
-            <w:pPr>
-              <w:spacing w:before="40" w:after="40" w:line="240" w:lineRule="exact"/>
-              <w:jc w:val="left"/>
-            </w:pPr>
-            <w:r/>
-            <w:r>
-              <w:rPr>
-                <w:rFonts w:ascii="Times New Roman" w:hAnsi="Times New Roman" w:eastAsia="Times New Roman"/>
-                <w:b w:val="0"/>
-                <w:i w:val="0"/>
-                <w:color w:val="000000"/>
-                <w:sz w:val="18"/>
-              </w:rPr>
-              <w:t>3 depot staff during peak hours</w:t>
-            </w:r>
-          </w:p>
-        </w:tc>
-        <w:tc>
-          <w:tcPr>
-            <w:tcW w:type="dxa" w:w="3120"/>
-            <w:shd w:fill="FFFFFF" w:val="clear"/>
-          </w:tcPr>
-          <w:p>
-            <w:pPr>
-              <w:spacing w:before="40" w:after="40" w:line="240" w:lineRule="exact"/>
-              <w:jc w:val="left"/>
-            </w:pPr>
-            <w:r/>
-            <w:r>
-              <w:rPr>
-                <w:rFonts w:ascii="Times New Roman" w:hAnsi="Times New Roman" w:eastAsia="Times New Roman"/>
-                <w:b w:val="0"/>
-                <w:i w:val="0"/>
-                <w:color w:val="000000"/>
-                <w:sz w:val="18"/>
-              </w:rPr>
-              <w:t>Human-controlled V7 correction with V8 evidence</w:t>
-            </w:r>
-          </w:p>
-        </w:tc>
-      </w:tr>
-      <w:tr>
-        <w:tc>
-          <w:tcPr>
-            <w:tcW w:type="dxa" w:w="3120"/>
-            <w:shd w:fill="F2F2F2" w:val="clear"/>
-          </w:tcPr>
-          <w:p>
-            <w:pPr>
-              <w:spacing w:before="40" w:after="40" w:line="240" w:lineRule="exact"/>
-              <w:jc w:val="left"/>
-            </w:pPr>
-            <w:r/>
-            <w:r>
-              <w:rPr>
-                <w:rFonts w:ascii="Times New Roman" w:hAnsi="Times New Roman" w:eastAsia="Times New Roman"/>
-                <w:b w:val="0"/>
-                <w:i w:val="0"/>
-                <w:color w:val="000000"/>
-                <w:sz w:val="18"/>
-              </w:rPr>
-              <w:t>Guide coordination</w:t>
-            </w:r>
-          </w:p>
-        </w:tc>
-        <w:tc>
-          <w:tcPr>
-            <w:tcW w:type="dxa" w:w="3120"/>
-            <w:shd w:fill="F2F2F2" w:val="clear"/>
-          </w:tcPr>
-          <w:p>
-            <w:pPr>
-              <w:spacing w:before="40" w:after="40" w:line="240" w:lineRule="exact"/>
-              <w:jc w:val="left"/>
-            </w:pPr>
-            <w:r/>
-            <w:r>
-              <w:rPr>
-                <w:rFonts w:ascii="Times New Roman" w:hAnsi="Times New Roman" w:eastAsia="Times New Roman"/>
-                <w:b w:val="0"/>
-                <w:i w:val="0"/>
-                <w:color w:val="000000"/>
-                <w:sz w:val="18"/>
-              </w:rPr>
-              <w:t>Project guide</w:t>
-            </w:r>
-          </w:p>
-        </w:tc>
-        <w:tc>
-          <w:tcPr>
-            <w:tcW w:type="dxa" w:w="3120"/>
-            <w:shd w:fill="F2F2F2" w:val="clear"/>
-          </w:tcPr>
-          <w:p>
-            <w:pPr>
-              <w:spacing w:before="40" w:after="40" w:line="240" w:lineRule="exact"/>
-              <w:jc w:val="left"/>
-            </w:pPr>
-            <w:r/>
-            <w:r>
-              <w:rPr>
-                <w:rFonts w:ascii="Times New Roman" w:hAnsi="Times New Roman" w:eastAsia="Times New Roman"/>
-                <w:b w:val="0"/>
-                <w:i w:val="0"/>
-                <w:color w:val="000000"/>
-                <w:sz w:val="18"/>
-              </w:rPr>
-              <w:t>Academic CEP requirements kept aligned with transit use</w:t>
-            </w:r>
-          </w:p>
-        </w:tc>
-      </w:tr>
-    </w:tbl>
-    <w:p/>
-    <w:p>
-      <w:pPr>
         <w:spacing w:before="0" w:after="160" w:line="320" w:lineRule="exact"/>
         <w:jc w:val="both"/>
       </w:pPr>
@@ -1006,274 +167,6 @@
         <w:t>A survey was conducted with 25 commuters who regularly use BEST services around the Dindoshi area. Among the respondents, 84% preferred an on-site physical display instead of a mobile application. This finding supported the decision to use physical LEDs at the bus stop rather than relying on an app-dependent design. A total of 92% wanted an overcrowding alert within 30 seconds of crowding buildup, indicating that delayed notifications would have limited operational value. In addition, 76% expected the passenger count to decrease gradually after a bus departed rather than being reset completely to zero. The most frequently reported frustration was the complete absence of any warning before crowding became excessive.</w:t>
       </w:r>
     </w:p>
-    <w:p>
-      <w:pPr>
-        <w:spacing w:before="160" w:after="120" w:line="280" w:lineRule="exact"/>
-        <w:jc w:val="center"/>
-      </w:pPr>
-      <w:r>
-        <w:rPr>
-          <w:rFonts w:ascii="Times New Roman" w:hAnsi="Times New Roman" w:eastAsia="Times New Roman"/>
-          <w:b/>
-          <w:i w:val="0"/>
-          <w:sz w:val="22"/>
-        </w:rPr>
-        <w:t>Table 6.3: Commuter Survey Findings</w:t>
-      </w:r>
-    </w:p>
-    <w:tbl>
-      <w:tblPr>
-        <w:tblStyle w:val="TableGrid"/>
-        <w:tblW w:type="auto" w:w="0"/>
-        <w:jc w:val="center"/>
-        <w:tblLook w:firstColumn="1" w:firstRow="1" w:lastColumn="0" w:lastRow="0" w:noHBand="0" w:noVBand="1" w:val="04A0"/>
-      </w:tblPr>
-      <w:tblGrid>
-        <w:gridCol w:w="4680"/>
-        <w:gridCol w:w="4680"/>
-      </w:tblGrid>
-      <w:tr>
-        <w:tc>
-          <w:tcPr>
-            <w:tcW w:type="dxa" w:w="4680"/>
-            <w:shd w:fill="1F4E79" w:val="clear"/>
-          </w:tcPr>
-          <w:p>
-            <w:pPr>
-              <w:spacing w:before="40" w:after="40" w:line="240" w:lineRule="exact"/>
-              <w:jc w:val="center"/>
-            </w:pPr>
-            <w:r/>
-            <w:r>
-              <w:rPr>
-                <w:rFonts w:ascii="Times New Roman" w:hAnsi="Times New Roman" w:eastAsia="Times New Roman"/>
-                <w:b/>
-                <w:i w:val="0"/>
-                <w:color w:val="FFFFFF"/>
-                <w:sz w:val="18"/>
-              </w:rPr>
-              <w:t>Survey finding (n = 25)</w:t>
-            </w:r>
-          </w:p>
-        </w:tc>
-        <w:tc>
-          <w:tcPr>
-            <w:tcW w:type="dxa" w:w="4680"/>
-            <w:shd w:fill="1F4E79" w:val="clear"/>
-          </w:tcPr>
-          <w:p>
-            <w:pPr>
-              <w:spacing w:before="40" w:after="40" w:line="240" w:lineRule="exact"/>
-              <w:jc w:val="center"/>
-            </w:pPr>
-            <w:r/>
-            <w:r>
-              <w:rPr>
-                <w:rFonts w:ascii="Times New Roman" w:hAnsi="Times New Roman" w:eastAsia="Times New Roman"/>
-                <w:b/>
-                <w:i w:val="0"/>
-                <w:color w:val="FFFFFF"/>
-                <w:sz w:val="18"/>
-              </w:rPr>
-              <w:t>Result</w:t>
-            </w:r>
-          </w:p>
-        </w:tc>
-      </w:tr>
-      <w:tr>
-        <w:tc>
-          <w:tcPr>
-            <w:tcW w:type="dxa" w:w="4680"/>
-            <w:shd w:fill="FFFFFF" w:val="clear"/>
-          </w:tcPr>
-          <w:p>
-            <w:pPr>
-              <w:spacing w:before="40" w:after="40" w:line="240" w:lineRule="exact"/>
-              <w:jc w:val="left"/>
-            </w:pPr>
-            <w:r/>
-            <w:r>
-              <w:rPr>
-                <w:rFonts w:ascii="Times New Roman" w:hAnsi="Times New Roman" w:eastAsia="Times New Roman"/>
-                <w:b w:val="0"/>
-                <w:i w:val="0"/>
-                <w:color w:val="000000"/>
-                <w:sz w:val="18"/>
-              </w:rPr>
-              <w:t>Preferred an on-site physical display instead of a mobile application</w:t>
-            </w:r>
-          </w:p>
-        </w:tc>
-        <w:tc>
-          <w:tcPr>
-            <w:tcW w:type="dxa" w:w="4680"/>
-            <w:shd w:fill="FFFFFF" w:val="clear"/>
-          </w:tcPr>
-          <w:p>
-            <w:pPr>
-              <w:spacing w:before="40" w:after="40" w:line="240" w:lineRule="exact"/>
-              <w:jc w:val="left"/>
-            </w:pPr>
-            <w:r/>
-            <w:r>
-              <w:rPr>
-                <w:rFonts w:ascii="Times New Roman" w:hAnsi="Times New Roman" w:eastAsia="Times New Roman"/>
-                <w:b w:val="0"/>
-                <w:i w:val="0"/>
-                <w:color w:val="000000"/>
-                <w:sz w:val="18"/>
-              </w:rPr>
-              <w:t>84% (21 of 25)</w:t>
-            </w:r>
-          </w:p>
-        </w:tc>
-      </w:tr>
-      <w:tr>
-        <w:tc>
-          <w:tcPr>
-            <w:tcW w:type="dxa" w:w="4680"/>
-            <w:shd w:fill="F2F2F2" w:val="clear"/>
-          </w:tcPr>
-          <w:p>
-            <w:pPr>
-              <w:spacing w:before="40" w:after="40" w:line="240" w:lineRule="exact"/>
-              <w:jc w:val="left"/>
-            </w:pPr>
-            <w:r/>
-            <w:r>
-              <w:rPr>
-                <w:rFonts w:ascii="Times New Roman" w:hAnsi="Times New Roman" w:eastAsia="Times New Roman"/>
-                <w:b w:val="0"/>
-                <w:i w:val="0"/>
-                <w:color w:val="000000"/>
-                <w:sz w:val="18"/>
-              </w:rPr>
-              <w:t>Wanted an overcrowding alert within 30 seconds</w:t>
-            </w:r>
-          </w:p>
-        </w:tc>
-        <w:tc>
-          <w:tcPr>
-            <w:tcW w:type="dxa" w:w="4680"/>
-            <w:shd w:fill="F2F2F2" w:val="clear"/>
-          </w:tcPr>
-          <w:p>
-            <w:pPr>
-              <w:spacing w:before="40" w:after="40" w:line="240" w:lineRule="exact"/>
-              <w:jc w:val="left"/>
-            </w:pPr>
-            <w:r/>
-            <w:r>
-              <w:rPr>
-                <w:rFonts w:ascii="Times New Roman" w:hAnsi="Times New Roman" w:eastAsia="Times New Roman"/>
-                <w:b w:val="0"/>
-                <w:i w:val="0"/>
-                <w:color w:val="000000"/>
-                <w:sz w:val="18"/>
-              </w:rPr>
-              <w:t>92% (23 of 25)</w:t>
-            </w:r>
-          </w:p>
-        </w:tc>
-      </w:tr>
-      <w:tr>
-        <w:tc>
-          <w:tcPr>
-            <w:tcW w:type="dxa" w:w="4680"/>
-            <w:shd w:fill="FFFFFF" w:val="clear"/>
-          </w:tcPr>
-          <w:p>
-            <w:pPr>
-              <w:spacing w:before="40" w:after="40" w:line="240" w:lineRule="exact"/>
-              <w:jc w:val="left"/>
-            </w:pPr>
-            <w:r/>
-            <w:r>
-              <w:rPr>
-                <w:rFonts w:ascii="Times New Roman" w:hAnsi="Times New Roman" w:eastAsia="Times New Roman"/>
-                <w:b w:val="0"/>
-                <w:i w:val="0"/>
-                <w:color w:val="000000"/>
-                <w:sz w:val="18"/>
-              </w:rPr>
-              <w:t>Expected the passenger count to decrease after a bus departed, not reset to zero</w:t>
-            </w:r>
-          </w:p>
-        </w:tc>
-        <w:tc>
-          <w:tcPr>
-            <w:tcW w:type="dxa" w:w="4680"/>
-            <w:shd w:fill="FFFFFF" w:val="clear"/>
-          </w:tcPr>
-          <w:p>
-            <w:pPr>
-              <w:spacing w:before="40" w:after="40" w:line="240" w:lineRule="exact"/>
-              <w:jc w:val="left"/>
-            </w:pPr>
-            <w:r/>
-            <w:r>
-              <w:rPr>
-                <w:rFonts w:ascii="Times New Roman" w:hAnsi="Times New Roman" w:eastAsia="Times New Roman"/>
-                <w:b w:val="0"/>
-                <w:i w:val="0"/>
-                <w:color w:val="000000"/>
-                <w:sz w:val="18"/>
-              </w:rPr>
-              <w:t>76% (19 of 25)</w:t>
-            </w:r>
-          </w:p>
-        </w:tc>
-      </w:tr>
-      <w:tr>
-        <w:tc>
-          <w:tcPr>
-            <w:tcW w:type="dxa" w:w="4680"/>
-            <w:shd w:fill="F2F2F2" w:val="clear"/>
-          </w:tcPr>
-          <w:p>
-            <w:pPr>
-              <w:spacing w:before="40" w:after="40" w:line="240" w:lineRule="exact"/>
-              <w:jc w:val="left"/>
-            </w:pPr>
-            <w:r/>
-            <w:r>
-              <w:rPr>
-                <w:rFonts w:ascii="Times New Roman" w:hAnsi="Times New Roman" w:eastAsia="Times New Roman"/>
-                <w:b w:val="0"/>
-                <w:i w:val="0"/>
-                <w:color w:val="000000"/>
-                <w:sz w:val="18"/>
-              </w:rPr>
-              <w:t>Most frequent frustration</w:t>
-            </w:r>
-          </w:p>
-        </w:tc>
-        <w:tc>
-          <w:tcPr>
-            <w:tcW w:type="dxa" w:w="4680"/>
-            <w:shd w:fill="F2F2F2" w:val="clear"/>
-          </w:tcPr>
-          <w:p>
-            <w:pPr>
-              <w:spacing w:before="40" w:after="40" w:line="240" w:lineRule="exact"/>
-              <w:jc w:val="left"/>
-            </w:pPr>
-            <w:r/>
-            <w:r>
-              <w:rPr>
-                <w:rFonts w:ascii="Times New Roman" w:hAnsi="Times New Roman" w:eastAsia="Times New Roman"/>
-                <w:b w:val="0"/>
-                <w:i w:val="0"/>
-                <w:color w:val="000000"/>
-                <w:sz w:val="18"/>
-              </w:rPr>
-              <w:t>No warning before crowding became excessive</w:t>
-            </w:r>
-          </w:p>
-        </w:tc>
-      </w:tr>
-    </w:tbl>
-    <w:p/>
     <w:p>
       <w:pPr>
         <w:spacing w:before="0" w:after="160" w:line="320" w:lineRule="exact"/>
@@ -1346,7 +239,7 @@
           <w:i w:val="0"/>
           <w:sz w:val="22"/>
         </w:rPr>
-        <w:t>Table 6.4: Pilot Deployment Details</w:t>
+        <w:t>Table 6.1: Pilot Deployment Details</w:t>
       </w:r>
     </w:p>
     <w:tbl>
@@ -1371,7 +264,7 @@
           <w:p>
             <w:pPr>
               <w:spacing w:before="40" w:after="40" w:line="240" w:lineRule="exact"/>
-              <w:jc w:val="center"/>
+              <w:jc w:val="left"/>
             </w:pPr>
             <w:r/>
             <w:r>
@@ -1394,7 +287,7 @@
           <w:p>
             <w:pPr>
               <w:spacing w:before="40" w:after="40" w:line="240" w:lineRule="exact"/>
-              <w:jc w:val="center"/>
+              <w:jc w:val="left"/>
             </w:pPr>
             <w:r/>
             <w:r>
@@ -1405,7 +298,7 @@
                 <w:color w:val="FFFFFF"/>
                 <w:sz w:val="18"/>
               </w:rPr>
-              <w:t>Date / duration</w:t>
+              <w:t>Date/Duration</w:t>
             </w:r>
           </w:p>
         </w:tc>
@@ -1417,7 +310,7 @@
           <w:p>
             <w:pPr>
               <w:spacing w:before="40" w:after="40" w:line="240" w:lineRule="exact"/>
-              <w:jc w:val="center"/>
+              <w:jc w:val="left"/>
             </w:pPr>
             <w:r/>
             <w:r>
@@ -1440,7 +333,7 @@
           <w:p>
             <w:pPr>
               <w:spacing w:before="40" w:after="40" w:line="240" w:lineRule="exact"/>
-              <w:jc w:val="center"/>
+              <w:jc w:val="left"/>
             </w:pPr>
             <w:r/>
             <w:r>
@@ -1451,7 +344,7 @@
                 <w:color w:val="FFFFFF"/>
                 <w:sz w:val="18"/>
               </w:rPr>
-              <w:t>Setup details</w:t>
+              <w:t>Setup Details</w:t>
             </w:r>
           </w:p>
         </w:tc>
@@ -1569,319 +462,6 @@
     </w:p>
     <w:p>
       <w:pPr>
-        <w:spacing w:before="160" w:after="120" w:line="280" w:lineRule="exact"/>
-        <w:jc w:val="center"/>
-      </w:pPr>
-      <w:r>
-        <w:rPr>
-          <w:rFonts w:ascii="Times New Roman" w:hAnsi="Times New Roman" w:eastAsia="Times New Roman"/>
-          <w:b/>
-          <w:i w:val="0"/>
-          <w:sz w:val="22"/>
-        </w:rPr>
-        <w:t>Table 6.5: Risk Classification Used in the Pilot</w:t>
-      </w:r>
-    </w:p>
-    <w:tbl>
-      <w:tblPr>
-        <w:tblStyle w:val="TableGrid"/>
-        <w:tblW w:type="auto" w:w="0"/>
-        <w:jc w:val="center"/>
-        <w:tblLook w:firstColumn="1" w:firstRow="1" w:lastColumn="0" w:lastRow="0" w:noHBand="0" w:noVBand="1" w:val="04A0"/>
-      </w:tblPr>
-      <w:tblGrid>
-        <w:gridCol w:w="3120"/>
-        <w:gridCol w:w="3120"/>
-        <w:gridCol w:w="3120"/>
-      </w:tblGrid>
-      <w:tr>
-        <w:tc>
-          <w:tcPr>
-            <w:tcW w:type="dxa" w:w="3120"/>
-            <w:shd w:fill="1F4E79" w:val="clear"/>
-          </w:tcPr>
-          <w:p>
-            <w:pPr>
-              <w:spacing w:before="40" w:after="40" w:line="240" w:lineRule="exact"/>
-              <w:jc w:val="center"/>
-            </w:pPr>
-            <w:r/>
-            <w:r>
-              <w:rPr>
-                <w:rFonts w:ascii="Times New Roman" w:hAnsi="Times New Roman" w:eastAsia="Times New Roman"/>
-                <w:b/>
-                <w:i w:val="0"/>
-                <w:color w:val="FFFFFF"/>
-                <w:sz w:val="18"/>
-              </w:rPr>
-              <w:t>Risk score</w:t>
-            </w:r>
-          </w:p>
-        </w:tc>
-        <w:tc>
-          <w:tcPr>
-            <w:tcW w:type="dxa" w:w="3120"/>
-            <w:shd w:fill="1F4E79" w:val="clear"/>
-          </w:tcPr>
-          <w:p>
-            <w:pPr>
-              <w:spacing w:before="40" w:after="40" w:line="240" w:lineRule="exact"/>
-              <w:jc w:val="center"/>
-            </w:pPr>
-            <w:r/>
-            <w:r>
-              <w:rPr>
-                <w:rFonts w:ascii="Times New Roman" w:hAnsi="Times New Roman" w:eastAsia="Times New Roman"/>
-                <w:b/>
-                <w:i w:val="0"/>
-                <w:color w:val="FFFFFF"/>
-                <w:sz w:val="18"/>
-              </w:rPr>
-              <w:t>Status</w:t>
-            </w:r>
-          </w:p>
-        </w:tc>
-        <w:tc>
-          <w:tcPr>
-            <w:tcW w:type="dxa" w:w="3120"/>
-            <w:shd w:fill="1F4E79" w:val="clear"/>
-          </w:tcPr>
-          <w:p>
-            <w:pPr>
-              <w:spacing w:before="40" w:after="40" w:line="240" w:lineRule="exact"/>
-              <w:jc w:val="center"/>
-            </w:pPr>
-            <w:r/>
-            <w:r>
-              <w:rPr>
-                <w:rFonts w:ascii="Times New Roman" w:hAnsi="Times New Roman" w:eastAsia="Times New Roman"/>
-                <w:b/>
-                <w:i w:val="0"/>
-                <w:color w:val="FFFFFF"/>
-                <w:sz w:val="18"/>
-              </w:rPr>
-              <w:t>On-site indication</w:t>
-            </w:r>
-          </w:p>
-        </w:tc>
-      </w:tr>
-      <w:tr>
-        <w:tc>
-          <w:tcPr>
-            <w:tcW w:type="dxa" w:w="3120"/>
-            <w:shd w:fill="FFFFFF" w:val="clear"/>
-          </w:tcPr>
-          <w:p>
-            <w:pPr>
-              <w:spacing w:before="40" w:after="40" w:line="240" w:lineRule="exact"/>
-              <w:jc w:val="left"/>
-            </w:pPr>
-            <w:r/>
-            <w:r>
-              <w:rPr>
-                <w:rFonts w:ascii="Times New Roman" w:hAnsi="Times New Roman" w:eastAsia="Times New Roman"/>
-                <w:b w:val="0"/>
-                <w:i w:val="0"/>
-                <w:color w:val="000000"/>
-                <w:sz w:val="18"/>
-              </w:rPr>
-              <w:t>0 – 40</w:t>
-            </w:r>
-          </w:p>
-        </w:tc>
-        <w:tc>
-          <w:tcPr>
-            <w:tcW w:type="dxa" w:w="3120"/>
-            <w:shd w:fill="FFFFFF" w:val="clear"/>
-          </w:tcPr>
-          <w:p>
-            <w:pPr>
-              <w:spacing w:before="40" w:after="40" w:line="240" w:lineRule="exact"/>
-              <w:jc w:val="left"/>
-            </w:pPr>
-            <w:r/>
-            <w:r>
-              <w:rPr>
-                <w:rFonts w:ascii="Times New Roman" w:hAnsi="Times New Roman" w:eastAsia="Times New Roman"/>
-                <w:b w:val="0"/>
-                <w:i w:val="0"/>
-                <w:color w:val="000000"/>
-                <w:sz w:val="18"/>
-              </w:rPr>
-              <w:t>NORMAL</w:t>
-            </w:r>
-          </w:p>
-        </w:tc>
-        <w:tc>
-          <w:tcPr>
-            <w:tcW w:type="dxa" w:w="3120"/>
-            <w:shd w:fill="FFFFFF" w:val="clear"/>
-          </w:tcPr>
-          <w:p>
-            <w:pPr>
-              <w:spacing w:before="40" w:after="40" w:line="240" w:lineRule="exact"/>
-              <w:jc w:val="left"/>
-            </w:pPr>
-            <w:r/>
-            <w:r>
-              <w:rPr>
-                <w:rFonts w:ascii="Times New Roman" w:hAnsi="Times New Roman" w:eastAsia="Times New Roman"/>
-                <w:b w:val="0"/>
-                <w:i w:val="0"/>
-                <w:color w:val="000000"/>
-                <w:sz w:val="18"/>
-              </w:rPr>
-              <w:t>Green LED</w:t>
-            </w:r>
-          </w:p>
-        </w:tc>
-      </w:tr>
-      <w:tr>
-        <w:tc>
-          <w:tcPr>
-            <w:tcW w:type="dxa" w:w="3120"/>
-            <w:shd w:fill="F2F2F2" w:val="clear"/>
-          </w:tcPr>
-          <w:p>
-            <w:pPr>
-              <w:spacing w:before="40" w:after="40" w:line="240" w:lineRule="exact"/>
-              <w:jc w:val="left"/>
-            </w:pPr>
-            <w:r/>
-            <w:r>
-              <w:rPr>
-                <w:rFonts w:ascii="Times New Roman" w:hAnsi="Times New Roman" w:eastAsia="Times New Roman"/>
-                <w:b w:val="0"/>
-                <w:i w:val="0"/>
-                <w:color w:val="000000"/>
-                <w:sz w:val="18"/>
-              </w:rPr>
-              <w:t>41 – 75 (including 75.0)</w:t>
-            </w:r>
-          </w:p>
-        </w:tc>
-        <w:tc>
-          <w:tcPr>
-            <w:tcW w:type="dxa" w:w="3120"/>
-            <w:shd w:fill="F2F2F2" w:val="clear"/>
-          </w:tcPr>
-          <w:p>
-            <w:pPr>
-              <w:spacing w:before="40" w:after="40" w:line="240" w:lineRule="exact"/>
-              <w:jc w:val="left"/>
-            </w:pPr>
-            <w:r/>
-            <w:r>
-              <w:rPr>
-                <w:rFonts w:ascii="Times New Roman" w:hAnsi="Times New Roman" w:eastAsia="Times New Roman"/>
-                <w:b w:val="0"/>
-                <w:i w:val="0"/>
-                <w:color w:val="000000"/>
-                <w:sz w:val="18"/>
-              </w:rPr>
-              <w:t>WARNING</w:t>
-            </w:r>
-          </w:p>
-        </w:tc>
-        <w:tc>
-          <w:tcPr>
-            <w:tcW w:type="dxa" w:w="3120"/>
-            <w:shd w:fill="F2F2F2" w:val="clear"/>
-          </w:tcPr>
-          <w:p>
-            <w:pPr>
-              <w:spacing w:before="40" w:after="40" w:line="240" w:lineRule="exact"/>
-              <w:jc w:val="left"/>
-            </w:pPr>
-            <w:r/>
-            <w:r>
-              <w:rPr>
-                <w:rFonts w:ascii="Times New Roman" w:hAnsi="Times New Roman" w:eastAsia="Times New Roman"/>
-                <w:b w:val="0"/>
-                <w:i w:val="0"/>
-                <w:color w:val="000000"/>
-                <w:sz w:val="18"/>
-              </w:rPr>
-              <w:t>No green / no red critical LED</w:t>
-            </w:r>
-          </w:p>
-        </w:tc>
-      </w:tr>
-      <w:tr>
-        <w:tc>
-          <w:tcPr>
-            <w:tcW w:type="dxa" w:w="3120"/>
-            <w:shd w:fill="FFFFFF" w:val="clear"/>
-          </w:tcPr>
-          <w:p>
-            <w:pPr>
-              <w:spacing w:before="40" w:after="40" w:line="240" w:lineRule="exact"/>
-              <w:jc w:val="left"/>
-            </w:pPr>
-            <w:r/>
-            <w:r>
-              <w:rPr>
-                <w:rFonts w:ascii="Times New Roman" w:hAnsi="Times New Roman" w:eastAsia="Times New Roman"/>
-                <w:b w:val="0"/>
-                <w:i w:val="0"/>
-                <w:color w:val="000000"/>
-                <w:sz w:val="18"/>
-              </w:rPr>
-              <w:t>&gt; 75</w:t>
-            </w:r>
-          </w:p>
-        </w:tc>
-        <w:tc>
-          <w:tcPr>
-            <w:tcW w:type="dxa" w:w="3120"/>
-            <w:shd w:fill="FFFFFF" w:val="clear"/>
-          </w:tcPr>
-          <w:p>
-            <w:pPr>
-              <w:spacing w:before="40" w:after="40" w:line="240" w:lineRule="exact"/>
-              <w:jc w:val="left"/>
-            </w:pPr>
-            <w:r/>
-            <w:r>
-              <w:rPr>
-                <w:rFonts w:ascii="Times New Roman" w:hAnsi="Times New Roman" w:eastAsia="Times New Roman"/>
-                <w:b w:val="0"/>
-                <w:i w:val="0"/>
-                <w:color w:val="000000"/>
-                <w:sz w:val="18"/>
-              </w:rPr>
-              <w:t>CRITICAL</w:t>
-            </w:r>
-          </w:p>
-        </w:tc>
-        <w:tc>
-          <w:tcPr>
-            <w:tcW w:type="dxa" w:w="3120"/>
-            <w:shd w:fill="FFFFFF" w:val="clear"/>
-          </w:tcPr>
-          <w:p>
-            <w:pPr>
-              <w:spacing w:before="40" w:after="40" w:line="240" w:lineRule="exact"/>
-              <w:jc w:val="left"/>
-            </w:pPr>
-            <w:r/>
-            <w:r>
-              <w:rPr>
-                <w:rFonts w:ascii="Times New Roman" w:hAnsi="Times New Roman" w:eastAsia="Times New Roman"/>
-                <w:b w:val="0"/>
-                <w:i w:val="0"/>
-                <w:color w:val="000000"/>
-                <w:sz w:val="18"/>
-              </w:rPr>
-              <w:t>Red LED + Telegram alert</w:t>
-            </w:r>
-          </w:p>
-        </w:tc>
-      </w:tr>
-    </w:tbl>
-    <w:p/>
-    <w:p>
-      <w:pPr>
         <w:spacing w:before="0" w:after="160" w:line="320" w:lineRule="exact"/>
         <w:jc w:val="both"/>
       </w:pPr>
@@ -1927,784 +507,6 @@
     </w:p>
     <w:p>
       <w:pPr>
-        <w:spacing w:before="160" w:after="120" w:line="280" w:lineRule="exact"/>
-        <w:jc w:val="center"/>
-      </w:pPr>
-      <w:r>
-        <w:rPr>
-          <w:rFonts w:ascii="Times New Roman" w:hAnsi="Times New Roman" w:eastAsia="Times New Roman"/>
-          <w:b/>
-          <w:i w:val="0"/>
-          <w:sz w:val="22"/>
-        </w:rPr>
-        <w:t>Table 6.6: Pilot Demonstration Scenarios</w:t>
-      </w:r>
-    </w:p>
-    <w:tbl>
-      <w:tblPr>
-        <w:tblStyle w:val="TableGrid"/>
-        <w:tblW w:type="auto" w:w="0"/>
-        <w:jc w:val="center"/>
-        <w:tblLook w:firstColumn="1" w:firstRow="1" w:lastColumn="0" w:lastRow="0" w:noHBand="0" w:noVBand="1" w:val="04A0"/>
-      </w:tblPr>
-      <w:tblGrid>
-        <w:gridCol w:w="1170"/>
-        <w:gridCol w:w="1170"/>
-        <w:gridCol w:w="1170"/>
-        <w:gridCol w:w="1170"/>
-        <w:gridCol w:w="1170"/>
-        <w:gridCol w:w="1170"/>
-        <w:gridCol w:w="1170"/>
-        <w:gridCol w:w="1170"/>
-      </w:tblGrid>
-      <w:tr>
-        <w:tc>
-          <w:tcPr>
-            <w:tcW w:type="dxa" w:w="1170"/>
-            <w:shd w:fill="1F4E79" w:val="clear"/>
-          </w:tcPr>
-          <w:p>
-            <w:pPr>
-              <w:spacing w:before="40" w:after="40" w:line="240" w:lineRule="exact"/>
-              <w:jc w:val="center"/>
-            </w:pPr>
-            <w:r/>
-            <w:r>
-              <w:rPr>
-                <w:rFonts w:ascii="Times New Roman" w:hAnsi="Times New Roman" w:eastAsia="Times New Roman"/>
-                <w:b/>
-                <w:i w:val="0"/>
-                <w:color w:val="FFFFFF"/>
-                <w:sz w:val="18"/>
-              </w:rPr>
-              <w:t>Scenario</w:t>
-            </w:r>
-          </w:p>
-        </w:tc>
-        <w:tc>
-          <w:tcPr>
-            <w:tcW w:type="dxa" w:w="1170"/>
-            <w:shd w:fill="1F4E79" w:val="clear"/>
-          </w:tcPr>
-          <w:p>
-            <w:pPr>
-              <w:spacing w:before="40" w:after="40" w:line="240" w:lineRule="exact"/>
-              <w:jc w:val="center"/>
-            </w:pPr>
-            <w:r/>
-            <w:r>
-              <w:rPr>
-                <w:rFonts w:ascii="Times New Roman" w:hAnsi="Times New Roman" w:eastAsia="Times New Roman"/>
-                <w:b/>
-                <w:i w:val="0"/>
-                <w:color w:val="FFFFFF"/>
-                <w:sz w:val="18"/>
-              </w:rPr>
-              <w:t>Count</w:t>
-            </w:r>
-          </w:p>
-        </w:tc>
-        <w:tc>
-          <w:tcPr>
-            <w:tcW w:type="dxa" w:w="1170"/>
-            <w:shd w:fill="1F4E79" w:val="clear"/>
-          </w:tcPr>
-          <w:p>
-            <w:pPr>
-              <w:spacing w:before="40" w:after="40" w:line="240" w:lineRule="exact"/>
-              <w:jc w:val="center"/>
-            </w:pPr>
-            <w:r/>
-            <w:r>
-              <w:rPr>
-                <w:rFonts w:ascii="Times New Roman" w:hAnsi="Times New Roman" w:eastAsia="Times New Roman"/>
-                <w:b/>
-                <w:i w:val="0"/>
-                <w:color w:val="FFFFFF"/>
-                <w:sz w:val="18"/>
-              </w:rPr>
-              <w:t>Rain</w:t>
-            </w:r>
-          </w:p>
-        </w:tc>
-        <w:tc>
-          <w:tcPr>
-            <w:tcW w:type="dxa" w:w="1170"/>
-            <w:shd w:fill="1F4E79" w:val="clear"/>
-          </w:tcPr>
-          <w:p>
-            <w:pPr>
-              <w:spacing w:before="40" w:after="40" w:line="240" w:lineRule="exact"/>
-              <w:jc w:val="center"/>
-            </w:pPr>
-            <w:r/>
-            <w:r>
-              <w:rPr>
-                <w:rFonts w:ascii="Times New Roman" w:hAnsi="Times New Roman" w:eastAsia="Times New Roman"/>
-                <w:b/>
-                <w:i w:val="0"/>
-                <w:color w:val="FFFFFF"/>
-                <w:sz w:val="18"/>
-              </w:rPr>
-              <w:t>Time</w:t>
-            </w:r>
-          </w:p>
-        </w:tc>
-        <w:tc>
-          <w:tcPr>
-            <w:tcW w:type="dxa" w:w="1170"/>
-            <w:shd w:fill="1F4E79" w:val="clear"/>
-          </w:tcPr>
-          <w:p>
-            <w:pPr>
-              <w:spacing w:before="40" w:after="40" w:line="240" w:lineRule="exact"/>
-              <w:jc w:val="center"/>
-            </w:pPr>
-            <w:r/>
-            <w:r>
-              <w:rPr>
-                <w:rFonts w:ascii="Times New Roman" w:hAnsi="Times New Roman" w:eastAsia="Times New Roman"/>
-                <w:b/>
-                <w:i w:val="0"/>
-                <w:color w:val="FFFFFF"/>
-                <w:sz w:val="18"/>
-              </w:rPr>
-              <w:t>Temp.</w:t>
-            </w:r>
-          </w:p>
-        </w:tc>
-        <w:tc>
-          <w:tcPr>
-            <w:tcW w:type="dxa" w:w="1170"/>
-            <w:shd w:fill="1F4E79" w:val="clear"/>
-          </w:tcPr>
-          <w:p>
-            <w:pPr>
-              <w:spacing w:before="40" w:after="40" w:line="240" w:lineRule="exact"/>
-              <w:jc w:val="center"/>
-            </w:pPr>
-            <w:r/>
-            <w:r>
-              <w:rPr>
-                <w:rFonts w:ascii="Times New Roman" w:hAnsi="Times New Roman" w:eastAsia="Times New Roman"/>
-                <w:b/>
-                <w:i w:val="0"/>
-                <w:color w:val="FFFFFF"/>
-                <w:sz w:val="18"/>
-              </w:rPr>
-              <w:t>Risk</w:t>
-            </w:r>
-          </w:p>
-        </w:tc>
-        <w:tc>
-          <w:tcPr>
-            <w:tcW w:type="dxa" w:w="1170"/>
-            <w:shd w:fill="1F4E79" w:val="clear"/>
-          </w:tcPr>
-          <w:p>
-            <w:pPr>
-              <w:spacing w:before="40" w:after="40" w:line="240" w:lineRule="exact"/>
-              <w:jc w:val="center"/>
-            </w:pPr>
-            <w:r/>
-            <w:r>
-              <w:rPr>
-                <w:rFonts w:ascii="Times New Roman" w:hAnsi="Times New Roman" w:eastAsia="Times New Roman"/>
-                <w:b/>
-                <w:i w:val="0"/>
-                <w:color w:val="FFFFFF"/>
-                <w:sz w:val="18"/>
-              </w:rPr>
-              <w:t>Class</w:t>
-            </w:r>
-          </w:p>
-        </w:tc>
-        <w:tc>
-          <w:tcPr>
-            <w:tcW w:type="dxa" w:w="1170"/>
-            <w:shd w:fill="1F4E79" w:val="clear"/>
-          </w:tcPr>
-          <w:p>
-            <w:pPr>
-              <w:spacing w:before="40" w:after="40" w:line="240" w:lineRule="exact"/>
-              <w:jc w:val="center"/>
-            </w:pPr>
-            <w:r/>
-            <w:r>
-              <w:rPr>
-                <w:rFonts w:ascii="Times New Roman" w:hAnsi="Times New Roman" w:eastAsia="Times New Roman"/>
-                <w:b/>
-                <w:i w:val="0"/>
-                <w:color w:val="FFFFFF"/>
-                <w:sz w:val="18"/>
-              </w:rPr>
-              <w:t>Output</w:t>
-            </w:r>
-          </w:p>
-        </w:tc>
-      </w:tr>
-      <w:tr>
-        <w:tc>
-          <w:tcPr>
-            <w:tcW w:type="dxa" w:w="1170"/>
-            <w:shd w:fill="FFFFFF" w:val="clear"/>
-          </w:tcPr>
-          <w:p>
-            <w:pPr>
-              <w:spacing w:before="40" w:after="40" w:line="240" w:lineRule="exact"/>
-              <w:jc w:val="left"/>
-            </w:pPr>
-            <w:r/>
-            <w:r>
-              <w:rPr>
-                <w:rFonts w:ascii="Times New Roman" w:hAnsi="Times New Roman" w:eastAsia="Times New Roman"/>
-                <w:b w:val="0"/>
-                <w:i w:val="0"/>
-                <w:color w:val="000000"/>
-                <w:sz w:val="18"/>
-              </w:rPr>
-              <w:t>1</w:t>
-            </w:r>
-          </w:p>
-        </w:tc>
-        <w:tc>
-          <w:tcPr>
-            <w:tcW w:type="dxa" w:w="1170"/>
-            <w:shd w:fill="FFFFFF" w:val="clear"/>
-          </w:tcPr>
-          <w:p>
-            <w:pPr>
-              <w:spacing w:before="40" w:after="40" w:line="240" w:lineRule="exact"/>
-              <w:jc w:val="left"/>
-            </w:pPr>
-            <w:r/>
-            <w:r>
-              <w:rPr>
-                <w:rFonts w:ascii="Times New Roman" w:hAnsi="Times New Roman" w:eastAsia="Times New Roman"/>
-                <w:b w:val="0"/>
-                <w:i w:val="0"/>
-                <w:color w:val="000000"/>
-                <w:sz w:val="18"/>
-              </w:rPr>
-              <w:t>45</w:t>
-            </w:r>
-          </w:p>
-        </w:tc>
-        <w:tc>
-          <w:tcPr>
-            <w:tcW w:type="dxa" w:w="1170"/>
-            <w:shd w:fill="FFFFFF" w:val="clear"/>
-          </w:tcPr>
-          <w:p>
-            <w:pPr>
-              <w:spacing w:before="40" w:after="40" w:line="240" w:lineRule="exact"/>
-              <w:jc w:val="left"/>
-            </w:pPr>
-            <w:r/>
-            <w:r>
-              <w:rPr>
-                <w:rFonts w:ascii="Times New Roman" w:hAnsi="Times New Roman" w:eastAsia="Times New Roman"/>
-                <w:b w:val="0"/>
-                <w:i w:val="0"/>
-                <w:color w:val="000000"/>
-                <w:sz w:val="18"/>
-              </w:rPr>
-              <w:t>Yes</w:t>
-            </w:r>
-          </w:p>
-        </w:tc>
-        <w:tc>
-          <w:tcPr>
-            <w:tcW w:type="dxa" w:w="1170"/>
-            <w:shd w:fill="FFFFFF" w:val="clear"/>
-          </w:tcPr>
-          <w:p>
-            <w:pPr>
-              <w:spacing w:before="40" w:after="40" w:line="240" w:lineRule="exact"/>
-              <w:jc w:val="left"/>
-            </w:pPr>
-            <w:r/>
-            <w:r>
-              <w:rPr>
-                <w:rFonts w:ascii="Times New Roman" w:hAnsi="Times New Roman" w:eastAsia="Times New Roman"/>
-                <w:b w:val="0"/>
-                <w:i w:val="0"/>
-                <w:color w:val="000000"/>
-                <w:sz w:val="18"/>
-              </w:rPr>
-              <w:t>17:30</w:t>
-            </w:r>
-          </w:p>
-        </w:tc>
-        <w:tc>
-          <w:tcPr>
-            <w:tcW w:type="dxa" w:w="1170"/>
-            <w:shd w:fill="FFFFFF" w:val="clear"/>
-          </w:tcPr>
-          <w:p>
-            <w:pPr>
-              <w:spacing w:before="40" w:after="40" w:line="240" w:lineRule="exact"/>
-              <w:jc w:val="left"/>
-            </w:pPr>
-            <w:r/>
-            <w:r>
-              <w:rPr>
-                <w:rFonts w:ascii="Times New Roman" w:hAnsi="Times New Roman" w:eastAsia="Times New Roman"/>
-                <w:b w:val="0"/>
-                <w:i w:val="0"/>
-                <w:color w:val="000000"/>
-                <w:sz w:val="18"/>
-              </w:rPr>
-              <w:t>30°C</w:t>
-            </w:r>
-          </w:p>
-        </w:tc>
-        <w:tc>
-          <w:tcPr>
-            <w:tcW w:type="dxa" w:w="1170"/>
-            <w:shd w:fill="FFFFFF" w:val="clear"/>
-          </w:tcPr>
-          <w:p>
-            <w:pPr>
-              <w:spacing w:before="40" w:after="40" w:line="240" w:lineRule="exact"/>
-              <w:jc w:val="left"/>
-            </w:pPr>
-            <w:r/>
-            <w:r>
-              <w:rPr>
-                <w:rFonts w:ascii="Times New Roman" w:hAnsi="Times New Roman" w:eastAsia="Times New Roman"/>
-                <w:b w:val="0"/>
-                <w:i w:val="0"/>
-                <w:color w:val="000000"/>
-                <w:sz w:val="18"/>
-              </w:rPr>
-              <w:t>90.0%</w:t>
-            </w:r>
-          </w:p>
-        </w:tc>
-        <w:tc>
-          <w:tcPr>
-            <w:tcW w:type="dxa" w:w="1170"/>
-            <w:shd w:fill="FFFFFF" w:val="clear"/>
-          </w:tcPr>
-          <w:p>
-            <w:pPr>
-              <w:spacing w:before="40" w:after="40" w:line="240" w:lineRule="exact"/>
-              <w:jc w:val="left"/>
-            </w:pPr>
-            <w:r/>
-            <w:r>
-              <w:rPr>
-                <w:rFonts w:ascii="Times New Roman" w:hAnsi="Times New Roman" w:eastAsia="Times New Roman"/>
-                <w:b w:val="0"/>
-                <w:i w:val="0"/>
-                <w:color w:val="000000"/>
-                <w:sz w:val="18"/>
-              </w:rPr>
-              <w:t>CRITICAL</w:t>
-            </w:r>
-          </w:p>
-        </w:tc>
-        <w:tc>
-          <w:tcPr>
-            <w:tcW w:type="dxa" w:w="1170"/>
-            <w:shd w:fill="FFFFFF" w:val="clear"/>
-          </w:tcPr>
-          <w:p>
-            <w:pPr>
-              <w:spacing w:before="40" w:after="40" w:line="240" w:lineRule="exact"/>
-              <w:jc w:val="left"/>
-            </w:pPr>
-            <w:r/>
-            <w:r>
-              <w:rPr>
-                <w:rFonts w:ascii="Times New Roman" w:hAnsi="Times New Roman" w:eastAsia="Times New Roman"/>
-                <w:b w:val="0"/>
-                <w:i w:val="0"/>
-                <w:color w:val="000000"/>
-                <w:sz w:val="18"/>
-              </w:rPr>
-              <w:t>Red LED; Telegram 0.81 s</w:t>
-            </w:r>
-          </w:p>
-        </w:tc>
-      </w:tr>
-      <w:tr>
-        <w:tc>
-          <w:tcPr>
-            <w:tcW w:type="dxa" w:w="1170"/>
-            <w:shd w:fill="F2F2F2" w:val="clear"/>
-          </w:tcPr>
-          <w:p>
-            <w:pPr>
-              <w:spacing w:before="40" w:after="40" w:line="240" w:lineRule="exact"/>
-              <w:jc w:val="left"/>
-            </w:pPr>
-            <w:r/>
-            <w:r>
-              <w:rPr>
-                <w:rFonts w:ascii="Times New Roman" w:hAnsi="Times New Roman" w:eastAsia="Times New Roman"/>
-                <w:b w:val="0"/>
-                <w:i w:val="0"/>
-                <w:color w:val="000000"/>
-                <w:sz w:val="18"/>
-              </w:rPr>
-              <w:t>2</w:t>
-            </w:r>
-          </w:p>
-        </w:tc>
-        <w:tc>
-          <w:tcPr>
-            <w:tcW w:type="dxa" w:w="1170"/>
-            <w:shd w:fill="F2F2F2" w:val="clear"/>
-          </w:tcPr>
-          <w:p>
-            <w:pPr>
-              <w:spacing w:before="40" w:after="40" w:line="240" w:lineRule="exact"/>
-              <w:jc w:val="left"/>
-            </w:pPr>
-            <w:r/>
-            <w:r>
-              <w:rPr>
-                <w:rFonts w:ascii="Times New Roman" w:hAnsi="Times New Roman" w:eastAsia="Times New Roman"/>
-                <w:b w:val="0"/>
-                <w:i w:val="0"/>
-                <w:color w:val="000000"/>
-                <w:sz w:val="18"/>
-              </w:rPr>
-              <w:t>30</w:t>
-            </w:r>
-          </w:p>
-        </w:tc>
-        <w:tc>
-          <w:tcPr>
-            <w:tcW w:type="dxa" w:w="1170"/>
-            <w:shd w:fill="F2F2F2" w:val="clear"/>
-          </w:tcPr>
-          <w:p>
-            <w:pPr>
-              <w:spacing w:before="40" w:after="40" w:line="240" w:lineRule="exact"/>
-              <w:jc w:val="left"/>
-            </w:pPr>
-            <w:r/>
-            <w:r>
-              <w:rPr>
-                <w:rFonts w:ascii="Times New Roman" w:hAnsi="Times New Roman" w:eastAsia="Times New Roman"/>
-                <w:b w:val="0"/>
-                <w:i w:val="0"/>
-                <w:color w:val="000000"/>
-                <w:sz w:val="18"/>
-              </w:rPr>
-              <w:t>Yes</w:t>
-            </w:r>
-          </w:p>
-        </w:tc>
-        <w:tc>
-          <w:tcPr>
-            <w:tcW w:type="dxa" w:w="1170"/>
-            <w:shd w:fill="F2F2F2" w:val="clear"/>
-          </w:tcPr>
-          <w:p>
-            <w:pPr>
-              <w:spacing w:before="40" w:after="40" w:line="240" w:lineRule="exact"/>
-              <w:jc w:val="left"/>
-            </w:pPr>
-            <w:r/>
-            <w:r>
-              <w:rPr>
-                <w:rFonts w:ascii="Times New Roman" w:hAnsi="Times New Roman" w:eastAsia="Times New Roman"/>
-                <w:b w:val="0"/>
-                <w:i w:val="0"/>
-                <w:color w:val="000000"/>
-                <w:sz w:val="18"/>
-              </w:rPr>
-              <w:t>17:30</w:t>
-            </w:r>
-          </w:p>
-        </w:tc>
-        <w:tc>
-          <w:tcPr>
-            <w:tcW w:type="dxa" w:w="1170"/>
-            <w:shd w:fill="F2F2F2" w:val="clear"/>
-          </w:tcPr>
-          <w:p>
-            <w:pPr>
-              <w:spacing w:before="40" w:after="40" w:line="240" w:lineRule="exact"/>
-              <w:jc w:val="left"/>
-            </w:pPr>
-            <w:r/>
-            <w:r>
-              <w:rPr>
-                <w:rFonts w:ascii="Times New Roman" w:hAnsi="Times New Roman" w:eastAsia="Times New Roman"/>
-                <w:b w:val="0"/>
-                <w:i w:val="0"/>
-                <w:color w:val="000000"/>
-                <w:sz w:val="18"/>
-              </w:rPr>
-              <w:t>30°C</w:t>
-            </w:r>
-          </w:p>
-        </w:tc>
-        <w:tc>
-          <w:tcPr>
-            <w:tcW w:type="dxa" w:w="1170"/>
-            <w:shd w:fill="F2F2F2" w:val="clear"/>
-          </w:tcPr>
-          <w:p>
-            <w:pPr>
-              <w:spacing w:before="40" w:after="40" w:line="240" w:lineRule="exact"/>
-              <w:jc w:val="left"/>
-            </w:pPr>
-            <w:r/>
-            <w:r>
-              <w:rPr>
-                <w:rFonts w:ascii="Times New Roman" w:hAnsi="Times New Roman" w:eastAsia="Times New Roman"/>
-                <w:b w:val="0"/>
-                <w:i w:val="0"/>
-                <w:color w:val="000000"/>
-                <w:sz w:val="18"/>
-              </w:rPr>
-              <w:t>65.0%</w:t>
-            </w:r>
-          </w:p>
-        </w:tc>
-        <w:tc>
-          <w:tcPr>
-            <w:tcW w:type="dxa" w:w="1170"/>
-            <w:shd w:fill="F2F2F2" w:val="clear"/>
-          </w:tcPr>
-          <w:p>
-            <w:pPr>
-              <w:spacing w:before="40" w:after="40" w:line="240" w:lineRule="exact"/>
-              <w:jc w:val="left"/>
-            </w:pPr>
-            <w:r/>
-            <w:r>
-              <w:rPr>
-                <w:rFonts w:ascii="Times New Roman" w:hAnsi="Times New Roman" w:eastAsia="Times New Roman"/>
-                <w:b w:val="0"/>
-                <w:i w:val="0"/>
-                <w:color w:val="000000"/>
-                <w:sz w:val="18"/>
-              </w:rPr>
-              <w:t>WARNING</w:t>
-            </w:r>
-          </w:p>
-        </w:tc>
-        <w:tc>
-          <w:tcPr>
-            <w:tcW w:type="dxa" w:w="1170"/>
-            <w:shd w:fill="F2F2F2" w:val="clear"/>
-          </w:tcPr>
-          <w:p>
-            <w:pPr>
-              <w:spacing w:before="40" w:after="40" w:line="240" w:lineRule="exact"/>
-              <w:jc w:val="left"/>
-            </w:pPr>
-            <w:r/>
-            <w:r>
-              <w:rPr>
-                <w:rFonts w:ascii="Times New Roman" w:hAnsi="Times New Roman" w:eastAsia="Times New Roman"/>
-                <w:b w:val="0"/>
-                <w:i w:val="0"/>
-                <w:color w:val="000000"/>
-                <w:sz w:val="18"/>
-              </w:rPr>
-              <w:t>No Telegram; no LED</w:t>
-            </w:r>
-          </w:p>
-        </w:tc>
-      </w:tr>
-      <w:tr>
-        <w:tc>
-          <w:tcPr>
-            <w:tcW w:type="dxa" w:w="1170"/>
-            <w:shd w:fill="FFFFFF" w:val="clear"/>
-          </w:tcPr>
-          <w:p>
-            <w:pPr>
-              <w:spacing w:before="40" w:after="40" w:line="240" w:lineRule="exact"/>
-              <w:jc w:val="left"/>
-            </w:pPr>
-            <w:r/>
-            <w:r>
-              <w:rPr>
-                <w:rFonts w:ascii="Times New Roman" w:hAnsi="Times New Roman" w:eastAsia="Times New Roman"/>
-                <w:b w:val="0"/>
-                <w:i w:val="0"/>
-                <w:color w:val="000000"/>
-                <w:sz w:val="18"/>
-              </w:rPr>
-              <w:t>3</w:t>
-            </w:r>
-          </w:p>
-        </w:tc>
-        <w:tc>
-          <w:tcPr>
-            <w:tcW w:type="dxa" w:w="1170"/>
-            <w:shd w:fill="FFFFFF" w:val="clear"/>
-          </w:tcPr>
-          <w:p>
-            <w:pPr>
-              <w:spacing w:before="40" w:after="40" w:line="240" w:lineRule="exact"/>
-              <w:jc w:val="left"/>
-            </w:pPr>
-            <w:r/>
-            <w:r>
-              <w:rPr>
-                <w:rFonts w:ascii="Times New Roman" w:hAnsi="Times New Roman" w:eastAsia="Times New Roman"/>
-                <w:b w:val="0"/>
-                <w:i w:val="0"/>
-                <w:color w:val="000000"/>
-                <w:sz w:val="18"/>
-              </w:rPr>
-              <w:t>0</w:t>
-            </w:r>
-          </w:p>
-        </w:tc>
-        <w:tc>
-          <w:tcPr>
-            <w:tcW w:type="dxa" w:w="1170"/>
-            <w:shd w:fill="FFFFFF" w:val="clear"/>
-          </w:tcPr>
-          <w:p>
-            <w:pPr>
-              <w:spacing w:before="40" w:after="40" w:line="240" w:lineRule="exact"/>
-              <w:jc w:val="left"/>
-            </w:pPr>
-            <w:r/>
-            <w:r>
-              <w:rPr>
-                <w:rFonts w:ascii="Times New Roman" w:hAnsi="Times New Roman" w:eastAsia="Times New Roman"/>
-                <w:b w:val="0"/>
-                <w:i w:val="0"/>
-                <w:color w:val="000000"/>
-                <w:sz w:val="18"/>
-              </w:rPr>
-              <w:t>Yes</w:t>
-            </w:r>
-          </w:p>
-        </w:tc>
-        <w:tc>
-          <w:tcPr>
-            <w:tcW w:type="dxa" w:w="1170"/>
-            <w:shd w:fill="FFFFFF" w:val="clear"/>
-          </w:tcPr>
-          <w:p>
-            <w:pPr>
-              <w:spacing w:before="40" w:after="40" w:line="240" w:lineRule="exact"/>
-              <w:jc w:val="left"/>
-            </w:pPr>
-            <w:r/>
-            <w:r>
-              <w:rPr>
-                <w:rFonts w:ascii="Times New Roman" w:hAnsi="Times New Roman" w:eastAsia="Times New Roman"/>
-                <w:b w:val="0"/>
-                <w:i w:val="0"/>
-                <w:color w:val="000000"/>
-                <w:sz w:val="18"/>
-              </w:rPr>
-              <w:t>Not rush / not heat</w:t>
-            </w:r>
-          </w:p>
-        </w:tc>
-        <w:tc>
-          <w:tcPr>
-            <w:tcW w:type="dxa" w:w="1170"/>
-            <w:shd w:fill="FFFFFF" w:val="clear"/>
-          </w:tcPr>
-          <w:p>
-            <w:pPr>
-              <w:spacing w:before="40" w:after="40" w:line="240" w:lineRule="exact"/>
-              <w:jc w:val="left"/>
-            </w:pPr>
-            <w:r/>
-            <w:r>
-              <w:rPr>
-                <w:rFonts w:ascii="Times New Roman" w:hAnsi="Times New Roman" w:eastAsia="Times New Roman"/>
-                <w:b w:val="0"/>
-                <w:i w:val="0"/>
-                <w:color w:val="000000"/>
-                <w:sz w:val="18"/>
-              </w:rPr>
-              <w:t>—</w:t>
-            </w:r>
-          </w:p>
-        </w:tc>
-        <w:tc>
-          <w:tcPr>
-            <w:tcW w:type="dxa" w:w="1170"/>
-            <w:shd w:fill="FFFFFF" w:val="clear"/>
-          </w:tcPr>
-          <w:p>
-            <w:pPr>
-              <w:spacing w:before="40" w:after="40" w:line="240" w:lineRule="exact"/>
-              <w:jc w:val="left"/>
-            </w:pPr>
-            <w:r/>
-            <w:r>
-              <w:rPr>
-                <w:rFonts w:ascii="Times New Roman" w:hAnsi="Times New Roman" w:eastAsia="Times New Roman"/>
-                <w:b w:val="0"/>
-                <w:i w:val="0"/>
-                <w:color w:val="000000"/>
-                <w:sz w:val="18"/>
-              </w:rPr>
-              <w:t>15.0%</w:t>
-            </w:r>
-          </w:p>
-        </w:tc>
-        <w:tc>
-          <w:tcPr>
-            <w:tcW w:type="dxa" w:w="1170"/>
-            <w:shd w:fill="FFFFFF" w:val="clear"/>
-          </w:tcPr>
-          <w:p>
-            <w:pPr>
-              <w:spacing w:before="40" w:after="40" w:line="240" w:lineRule="exact"/>
-              <w:jc w:val="left"/>
-            </w:pPr>
-            <w:r/>
-            <w:r>
-              <w:rPr>
-                <w:rFonts w:ascii="Times New Roman" w:hAnsi="Times New Roman" w:eastAsia="Times New Roman"/>
-                <w:b w:val="0"/>
-                <w:i w:val="0"/>
-                <w:color w:val="000000"/>
-                <w:sz w:val="18"/>
-              </w:rPr>
-              <w:t>NORMAL</w:t>
-            </w:r>
-          </w:p>
-        </w:tc>
-        <w:tc>
-          <w:tcPr>
-            <w:tcW w:type="dxa" w:w="1170"/>
-            <w:shd w:fill="FFFFFF" w:val="clear"/>
-          </w:tcPr>
-          <w:p>
-            <w:pPr>
-              <w:spacing w:before="40" w:after="40" w:line="240" w:lineRule="exact"/>
-              <w:jc w:val="left"/>
-            </w:pPr>
-            <w:r/>
-            <w:r>
-              <w:rPr>
-                <w:rFonts w:ascii="Times New Roman" w:hAnsi="Times New Roman" w:eastAsia="Times New Roman"/>
-                <w:b w:val="0"/>
-                <w:i w:val="0"/>
-                <w:color w:val="000000"/>
-                <w:sz w:val="18"/>
-              </w:rPr>
-              <w:t>Green LED</w:t>
-            </w:r>
-          </w:p>
-        </w:tc>
-      </w:tr>
-    </w:tbl>
-    <w:p/>
-    <w:p>
-      <w:pPr>
         <w:spacing w:before="0" w:after="160" w:line="320" w:lineRule="exact"/>
         <w:jc w:val="both"/>
       </w:pPr>
@@ -2733,418 +535,6 @@
         <w:t>The measured Blynk round-trip time was 891 ms, the Random Forest prediction required 10.51 ms, and the CSV append operation was recorded as 0.00 ms at the available timing precision. The VL53L0X was polled every 150 ms, brain.py operated on a five-second cycle, and Telegram alerts used a 60-second cooldown.</w:t>
       </w:r>
     </w:p>
-    <w:p>
-      <w:pPr>
-        <w:spacing w:before="160" w:after="120" w:line="280" w:lineRule="exact"/>
-        <w:jc w:val="center"/>
-      </w:pPr>
-      <w:r>
-        <w:rPr>
-          <w:rFonts w:ascii="Times New Roman" w:hAnsi="Times New Roman" w:eastAsia="Times New Roman"/>
-          <w:b/>
-          <w:i w:val="0"/>
-          <w:sz w:val="22"/>
-        </w:rPr>
-        <w:t>Table 6.7: Pilot Timing and Operator Check</w:t>
-      </w:r>
-    </w:p>
-    <w:tbl>
-      <w:tblPr>
-        <w:tblStyle w:val="TableGrid"/>
-        <w:tblW w:type="auto" w:w="0"/>
-        <w:jc w:val="center"/>
-        <w:tblLook w:firstColumn="1" w:firstRow="1" w:lastColumn="0" w:lastRow="0" w:noHBand="0" w:noVBand="1" w:val="04A0"/>
-      </w:tblPr>
-      <w:tblGrid>
-        <w:gridCol w:w="4680"/>
-        <w:gridCol w:w="4680"/>
-      </w:tblGrid>
-      <w:tr>
-        <w:tc>
-          <w:tcPr>
-            <w:tcW w:type="dxa" w:w="4680"/>
-            <w:shd w:fill="1F4E79" w:val="clear"/>
-          </w:tcPr>
-          <w:p>
-            <w:pPr>
-              <w:spacing w:before="40" w:after="40" w:line="240" w:lineRule="exact"/>
-              <w:jc w:val="center"/>
-            </w:pPr>
-            <w:r/>
-            <w:r>
-              <w:rPr>
-                <w:rFonts w:ascii="Times New Roman" w:hAnsi="Times New Roman" w:eastAsia="Times New Roman"/>
-                <w:b/>
-                <w:i w:val="0"/>
-                <w:color w:val="FFFFFF"/>
-                <w:sz w:val="18"/>
-              </w:rPr>
-              <w:t>Measurement</w:t>
-            </w:r>
-          </w:p>
-        </w:tc>
-        <w:tc>
-          <w:tcPr>
-            <w:tcW w:type="dxa" w:w="4680"/>
-            <w:shd w:fill="1F4E79" w:val="clear"/>
-          </w:tcPr>
-          <w:p>
-            <w:pPr>
-              <w:spacing w:before="40" w:after="40" w:line="240" w:lineRule="exact"/>
-              <w:jc w:val="center"/>
-            </w:pPr>
-            <w:r/>
-            <w:r>
-              <w:rPr>
-                <w:rFonts w:ascii="Times New Roman" w:hAnsi="Times New Roman" w:eastAsia="Times New Roman"/>
-                <w:b/>
-                <w:i w:val="0"/>
-                <w:color w:val="FFFFFF"/>
-                <w:sz w:val="18"/>
-              </w:rPr>
-              <w:t>Value</w:t>
-            </w:r>
-          </w:p>
-        </w:tc>
-      </w:tr>
-      <w:tr>
-        <w:tc>
-          <w:tcPr>
-            <w:tcW w:type="dxa" w:w="4680"/>
-            <w:shd w:fill="FFFFFF" w:val="clear"/>
-          </w:tcPr>
-          <w:p>
-            <w:pPr>
-              <w:spacing w:before="40" w:after="40" w:line="240" w:lineRule="exact"/>
-              <w:jc w:val="left"/>
-            </w:pPr>
-            <w:r/>
-            <w:r>
-              <w:rPr>
-                <w:rFonts w:ascii="Times New Roman" w:hAnsi="Times New Roman" w:eastAsia="Times New Roman"/>
-                <w:b w:val="0"/>
-                <w:i w:val="0"/>
-                <w:color w:val="000000"/>
-                <w:sz w:val="18"/>
-              </w:rPr>
-              <w:t>Blynk round-trip time</w:t>
-            </w:r>
-          </w:p>
-        </w:tc>
-        <w:tc>
-          <w:tcPr>
-            <w:tcW w:type="dxa" w:w="4680"/>
-            <w:shd w:fill="FFFFFF" w:val="clear"/>
-          </w:tcPr>
-          <w:p>
-            <w:pPr>
-              <w:spacing w:before="40" w:after="40" w:line="240" w:lineRule="exact"/>
-              <w:jc w:val="left"/>
-            </w:pPr>
-            <w:r/>
-            <w:r>
-              <w:rPr>
-                <w:rFonts w:ascii="Times New Roman" w:hAnsi="Times New Roman" w:eastAsia="Times New Roman"/>
-                <w:b w:val="0"/>
-                <w:i w:val="0"/>
-                <w:color w:val="000000"/>
-                <w:sz w:val="18"/>
-              </w:rPr>
-              <w:t>891 ms</w:t>
-            </w:r>
-          </w:p>
-        </w:tc>
-      </w:tr>
-      <w:tr>
-        <w:tc>
-          <w:tcPr>
-            <w:tcW w:type="dxa" w:w="4680"/>
-            <w:shd w:fill="F2F2F2" w:val="clear"/>
-          </w:tcPr>
-          <w:p>
-            <w:pPr>
-              <w:spacing w:before="40" w:after="40" w:line="240" w:lineRule="exact"/>
-              <w:jc w:val="left"/>
-            </w:pPr>
-            <w:r/>
-            <w:r>
-              <w:rPr>
-                <w:rFonts w:ascii="Times New Roman" w:hAnsi="Times New Roman" w:eastAsia="Times New Roman"/>
-                <w:b w:val="0"/>
-                <w:i w:val="0"/>
-                <w:color w:val="000000"/>
-                <w:sz w:val="18"/>
-              </w:rPr>
-              <w:t>Random Forest prediction</w:t>
-            </w:r>
-          </w:p>
-        </w:tc>
-        <w:tc>
-          <w:tcPr>
-            <w:tcW w:type="dxa" w:w="4680"/>
-            <w:shd w:fill="F2F2F2" w:val="clear"/>
-          </w:tcPr>
-          <w:p>
-            <w:pPr>
-              <w:spacing w:before="40" w:after="40" w:line="240" w:lineRule="exact"/>
-              <w:jc w:val="left"/>
-            </w:pPr>
-            <w:r/>
-            <w:r>
-              <w:rPr>
-                <w:rFonts w:ascii="Times New Roman" w:hAnsi="Times New Roman" w:eastAsia="Times New Roman"/>
-                <w:b w:val="0"/>
-                <w:i w:val="0"/>
-                <w:color w:val="000000"/>
-                <w:sz w:val="18"/>
-              </w:rPr>
-              <w:t>10.51 ms</w:t>
-            </w:r>
-          </w:p>
-        </w:tc>
-      </w:tr>
-      <w:tr>
-        <w:tc>
-          <w:tcPr>
-            <w:tcW w:type="dxa" w:w="4680"/>
-            <w:shd w:fill="FFFFFF" w:val="clear"/>
-          </w:tcPr>
-          <w:p>
-            <w:pPr>
-              <w:spacing w:before="40" w:after="40" w:line="240" w:lineRule="exact"/>
-              <w:jc w:val="left"/>
-            </w:pPr>
-            <w:r/>
-            <w:r>
-              <w:rPr>
-                <w:rFonts w:ascii="Times New Roman" w:hAnsi="Times New Roman" w:eastAsia="Times New Roman"/>
-                <w:b w:val="0"/>
-                <w:i w:val="0"/>
-                <w:color w:val="000000"/>
-                <w:sz w:val="18"/>
-              </w:rPr>
-              <w:t>CSV append</w:t>
-            </w:r>
-          </w:p>
-        </w:tc>
-        <w:tc>
-          <w:tcPr>
-            <w:tcW w:type="dxa" w:w="4680"/>
-            <w:shd w:fill="FFFFFF" w:val="clear"/>
-          </w:tcPr>
-          <w:p>
-            <w:pPr>
-              <w:spacing w:before="40" w:after="40" w:line="240" w:lineRule="exact"/>
-              <w:jc w:val="left"/>
-            </w:pPr>
-            <w:r/>
-            <w:r>
-              <w:rPr>
-                <w:rFonts w:ascii="Times New Roman" w:hAnsi="Times New Roman" w:eastAsia="Times New Roman"/>
-                <w:b w:val="0"/>
-                <w:i w:val="0"/>
-                <w:color w:val="000000"/>
-                <w:sz w:val="18"/>
-              </w:rPr>
-              <w:t>0.00 ms (timer precision)</w:t>
-            </w:r>
-          </w:p>
-        </w:tc>
-      </w:tr>
-      <w:tr>
-        <w:tc>
-          <w:tcPr>
-            <w:tcW w:type="dxa" w:w="4680"/>
-            <w:shd w:fill="F2F2F2" w:val="clear"/>
-          </w:tcPr>
-          <w:p>
-            <w:pPr>
-              <w:spacing w:before="40" w:after="40" w:line="240" w:lineRule="exact"/>
-              <w:jc w:val="left"/>
-            </w:pPr>
-            <w:r/>
-            <w:r>
-              <w:rPr>
-                <w:rFonts w:ascii="Times New Roman" w:hAnsi="Times New Roman" w:eastAsia="Times New Roman"/>
-                <w:b w:val="0"/>
-                <w:i w:val="0"/>
-                <w:color w:val="000000"/>
-                <w:sz w:val="18"/>
-              </w:rPr>
-              <w:t>VL53L0X poll interval</w:t>
-            </w:r>
-          </w:p>
-        </w:tc>
-        <w:tc>
-          <w:tcPr>
-            <w:tcW w:type="dxa" w:w="4680"/>
-            <w:shd w:fill="F2F2F2" w:val="clear"/>
-          </w:tcPr>
-          <w:p>
-            <w:pPr>
-              <w:spacing w:before="40" w:after="40" w:line="240" w:lineRule="exact"/>
-              <w:jc w:val="left"/>
-            </w:pPr>
-            <w:r/>
-            <w:r>
-              <w:rPr>
-                <w:rFonts w:ascii="Times New Roman" w:hAnsi="Times New Roman" w:eastAsia="Times New Roman"/>
-                <w:b w:val="0"/>
-                <w:i w:val="0"/>
-                <w:color w:val="000000"/>
-                <w:sz w:val="18"/>
-              </w:rPr>
-              <w:t>150 ms</w:t>
-            </w:r>
-          </w:p>
-        </w:tc>
-      </w:tr>
-      <w:tr>
-        <w:tc>
-          <w:tcPr>
-            <w:tcW w:type="dxa" w:w="4680"/>
-            <w:shd w:fill="FFFFFF" w:val="clear"/>
-          </w:tcPr>
-          <w:p>
-            <w:pPr>
-              <w:spacing w:before="40" w:after="40" w:line="240" w:lineRule="exact"/>
-              <w:jc w:val="left"/>
-            </w:pPr>
-            <w:r/>
-            <w:r>
-              <w:rPr>
-                <w:rFonts w:ascii="Times New Roman" w:hAnsi="Times New Roman" w:eastAsia="Times New Roman"/>
-                <w:b w:val="0"/>
-                <w:i w:val="0"/>
-                <w:color w:val="000000"/>
-                <w:sz w:val="18"/>
-              </w:rPr>
-              <w:t>brain.py cycle</w:t>
-            </w:r>
-          </w:p>
-        </w:tc>
-        <w:tc>
-          <w:tcPr>
-            <w:tcW w:type="dxa" w:w="4680"/>
-            <w:shd w:fill="FFFFFF" w:val="clear"/>
-          </w:tcPr>
-          <w:p>
-            <w:pPr>
-              <w:spacing w:before="40" w:after="40" w:line="240" w:lineRule="exact"/>
-              <w:jc w:val="left"/>
-            </w:pPr>
-            <w:r/>
-            <w:r>
-              <w:rPr>
-                <w:rFonts w:ascii="Times New Roman" w:hAnsi="Times New Roman" w:eastAsia="Times New Roman"/>
-                <w:b w:val="0"/>
-                <w:i w:val="0"/>
-                <w:color w:val="000000"/>
-                <w:sz w:val="18"/>
-              </w:rPr>
-              <w:t>5 seconds</w:t>
-            </w:r>
-          </w:p>
-        </w:tc>
-      </w:tr>
-      <w:tr>
-        <w:tc>
-          <w:tcPr>
-            <w:tcW w:type="dxa" w:w="4680"/>
-            <w:shd w:fill="F2F2F2" w:val="clear"/>
-          </w:tcPr>
-          <w:p>
-            <w:pPr>
-              <w:spacing w:before="40" w:after="40" w:line="240" w:lineRule="exact"/>
-              <w:jc w:val="left"/>
-            </w:pPr>
-            <w:r/>
-            <w:r>
-              <w:rPr>
-                <w:rFonts w:ascii="Times New Roman" w:hAnsi="Times New Roman" w:eastAsia="Times New Roman"/>
-                <w:b w:val="0"/>
-                <w:i w:val="0"/>
-                <w:color w:val="000000"/>
-                <w:sz w:val="18"/>
-              </w:rPr>
-              <w:t>Telegram alert cooldown</w:t>
-            </w:r>
-          </w:p>
-        </w:tc>
-        <w:tc>
-          <w:tcPr>
-            <w:tcW w:type="dxa" w:w="4680"/>
-            <w:shd w:fill="F2F2F2" w:val="clear"/>
-          </w:tcPr>
-          <w:p>
-            <w:pPr>
-              <w:spacing w:before="40" w:after="40" w:line="240" w:lineRule="exact"/>
-              <w:jc w:val="left"/>
-            </w:pPr>
-            <w:r/>
-            <w:r>
-              <w:rPr>
-                <w:rFonts w:ascii="Times New Roman" w:hAnsi="Times New Roman" w:eastAsia="Times New Roman"/>
-                <w:b w:val="0"/>
-                <w:i w:val="0"/>
-                <w:color w:val="000000"/>
-                <w:sz w:val="18"/>
-              </w:rPr>
-              <w:t>60 seconds</w:t>
-            </w:r>
-          </w:p>
-        </w:tc>
-      </w:tr>
-      <w:tr>
-        <w:tc>
-          <w:tcPr>
-            <w:tcW w:type="dxa" w:w="4680"/>
-            <w:shd w:fill="FFFFFF" w:val="clear"/>
-          </w:tcPr>
-          <w:p>
-            <w:pPr>
-              <w:spacing w:before="40" w:after="40" w:line="240" w:lineRule="exact"/>
-              <w:jc w:val="left"/>
-            </w:pPr>
-            <w:r/>
-            <w:r>
-              <w:rPr>
-                <w:rFonts w:ascii="Times New Roman" w:hAnsi="Times New Roman" w:eastAsia="Times New Roman"/>
-                <w:b w:val="0"/>
-                <w:i w:val="0"/>
-                <w:color w:val="000000"/>
-                <w:sz w:val="18"/>
-              </w:rPr>
-              <w:t>V7 operator test</w:t>
-            </w:r>
-          </w:p>
-        </w:tc>
-        <w:tc>
-          <w:tcPr>
-            <w:tcW w:type="dxa" w:w="4680"/>
-            <w:shd w:fill="FFFFFF" w:val="clear"/>
-          </w:tcPr>
-          <w:p>
-            <w:pPr>
-              <w:spacing w:before="40" w:after="40" w:line="240" w:lineRule="exact"/>
-              <w:jc w:val="left"/>
-            </w:pPr>
-            <w:r/>
-            <w:r>
-              <w:rPr>
-                <w:rFonts w:ascii="Times New Roman" w:hAnsi="Times New Roman" w:eastAsia="Times New Roman"/>
-                <w:b w:val="0"/>
-                <w:i w:val="0"/>
-                <w:color w:val="000000"/>
-                <w:sz w:val="18"/>
-              </w:rPr>
-              <w:t>Count 50 → 20 (subtract 30, not reset)</w:t>
-            </w:r>
-          </w:p>
-        </w:tc>
-      </w:tr>
-    </w:tbl>
-    <w:p/>
     <w:p>
       <w:pPr>
         <w:spacing w:before="280" w:after="160" w:line="320" w:lineRule="exact"/>
@@ -3192,226 +582,6 @@
     </w:p>
     <w:p>
       <w:pPr>
-        <w:spacing w:before="160" w:after="120" w:line="280" w:lineRule="exact"/>
-        <w:jc w:val="center"/>
-      </w:pPr>
-      <w:r>
-        <w:rPr>
-          <w:rFonts w:ascii="Times New Roman" w:hAnsi="Times New Roman" w:eastAsia="Times New Roman"/>
-          <w:b/>
-          <w:i w:val="0"/>
-          <w:sz w:val="22"/>
-        </w:rPr>
-        <w:t>Table 6.8: User Training Summary</w:t>
-      </w:r>
-    </w:p>
-    <w:tbl>
-      <w:tblPr>
-        <w:tblStyle w:val="TableGrid"/>
-        <w:tblW w:type="auto" w:w="0"/>
-        <w:jc w:val="center"/>
-        <w:tblLook w:firstColumn="1" w:firstRow="1" w:lastColumn="0" w:lastRow="0" w:noHBand="0" w:noVBand="1" w:val="04A0"/>
-      </w:tblPr>
-      <w:tblGrid>
-        <w:gridCol w:w="4680"/>
-        <w:gridCol w:w="4680"/>
-      </w:tblGrid>
-      <w:tr>
-        <w:tc>
-          <w:tcPr>
-            <w:tcW w:type="dxa" w:w="4680"/>
-            <w:shd w:fill="1F4E79" w:val="clear"/>
-          </w:tcPr>
-          <w:p>
-            <w:pPr>
-              <w:spacing w:before="40" w:after="40" w:line="240" w:lineRule="exact"/>
-              <w:jc w:val="center"/>
-            </w:pPr>
-            <w:r/>
-            <w:r>
-              <w:rPr>
-                <w:rFonts w:ascii="Times New Roman" w:hAnsi="Times New Roman" w:eastAsia="Times New Roman"/>
-                <w:b/>
-                <w:i w:val="0"/>
-                <w:color w:val="FFFFFF"/>
-                <w:sz w:val="18"/>
-              </w:rPr>
-              <w:t>Audience</w:t>
-            </w:r>
-          </w:p>
-        </w:tc>
-        <w:tc>
-          <w:tcPr>
-            <w:tcW w:type="dxa" w:w="4680"/>
-            <w:shd w:fill="1F4E79" w:val="clear"/>
-          </w:tcPr>
-          <w:p>
-            <w:pPr>
-              <w:spacing w:before="40" w:after="40" w:line="240" w:lineRule="exact"/>
-              <w:jc w:val="center"/>
-            </w:pPr>
-            <w:r/>
-            <w:r>
-              <w:rPr>
-                <w:rFonts w:ascii="Times New Roman" w:hAnsi="Times New Roman" w:eastAsia="Times New Roman"/>
-                <w:b/>
-                <w:i w:val="0"/>
-                <w:color w:val="FFFFFF"/>
-                <w:sz w:val="18"/>
-              </w:rPr>
-              <w:t>Training point</w:t>
-            </w:r>
-          </w:p>
-        </w:tc>
-      </w:tr>
-      <w:tr>
-        <w:tc>
-          <w:tcPr>
-            <w:tcW w:type="dxa" w:w="4680"/>
-            <w:shd w:fill="FFFFFF" w:val="clear"/>
-          </w:tcPr>
-          <w:p>
-            <w:pPr>
-              <w:spacing w:before="40" w:after="40" w:line="240" w:lineRule="exact"/>
-              <w:jc w:val="left"/>
-            </w:pPr>
-            <w:r/>
-            <w:r>
-              <w:rPr>
-                <w:rFonts w:ascii="Times New Roman" w:hAnsi="Times New Roman" w:eastAsia="Times New Roman"/>
-                <w:b w:val="0"/>
-                <w:i w:val="0"/>
-                <w:color w:val="000000"/>
-                <w:sz w:val="18"/>
-              </w:rPr>
-              <w:t>Commuters</w:t>
-            </w:r>
-          </w:p>
-        </w:tc>
-        <w:tc>
-          <w:tcPr>
-            <w:tcW w:type="dxa" w:w="4680"/>
-            <w:shd w:fill="FFFFFF" w:val="clear"/>
-          </w:tcPr>
-          <w:p>
-            <w:pPr>
-              <w:spacing w:before="40" w:after="40" w:line="240" w:lineRule="exact"/>
-              <w:jc w:val="left"/>
-            </w:pPr>
-            <w:r/>
-            <w:r>
-              <w:rPr>
-                <w:rFonts w:ascii="Times New Roman" w:hAnsi="Times New Roman" w:eastAsia="Times New Roman"/>
-                <w:b w:val="0"/>
-                <w:i w:val="0"/>
-                <w:color w:val="000000"/>
-                <w:sz w:val="18"/>
-              </w:rPr>
-              <w:t>Green LED = NORMAL; red LED = CRITICAL overcrowding (not a fire alarm)</w:t>
-            </w:r>
-          </w:p>
-        </w:tc>
-      </w:tr>
-      <w:tr>
-        <w:tc>
-          <w:tcPr>
-            <w:tcW w:type="dxa" w:w="4680"/>
-            <w:shd w:fill="F2F2F2" w:val="clear"/>
-          </w:tcPr>
-          <w:p>
-            <w:pPr>
-              <w:spacing w:before="40" w:after="40" w:line="240" w:lineRule="exact"/>
-              <w:jc w:val="left"/>
-            </w:pPr>
-            <w:r/>
-            <w:r>
-              <w:rPr>
-                <w:rFonts w:ascii="Times New Roman" w:hAnsi="Times New Roman" w:eastAsia="Times New Roman"/>
-                <w:b w:val="0"/>
-                <w:i w:val="0"/>
-                <w:color w:val="000000"/>
-                <w:sz w:val="18"/>
-              </w:rPr>
-              <w:t>Depot staff</w:t>
-            </w:r>
-          </w:p>
-        </w:tc>
-        <w:tc>
-          <w:tcPr>
-            <w:tcW w:type="dxa" w:w="4680"/>
-            <w:shd w:fill="F2F2F2" w:val="clear"/>
-          </w:tcPr>
-          <w:p>
-            <w:pPr>
-              <w:spacing w:before="40" w:after="40" w:line="240" w:lineRule="exact"/>
-              <w:jc w:val="left"/>
-            </w:pPr>
-            <w:r/>
-            <w:r>
-              <w:rPr>
-                <w:rFonts w:ascii="Times New Roman" w:hAnsi="Times New Roman" w:eastAsia="Times New Roman"/>
-                <w:b w:val="0"/>
-                <w:i w:val="0"/>
-                <w:color w:val="000000"/>
-                <w:sz w:val="18"/>
-              </w:rPr>
-              <w:t>Check V8, then press V7 once per confirmed bus departure</w:t>
-            </w:r>
-          </w:p>
-        </w:tc>
-      </w:tr>
-      <w:tr>
-        <w:tc>
-          <w:tcPr>
-            <w:tcW w:type="dxa" w:w="4680"/>
-            <w:shd w:fill="FFFFFF" w:val="clear"/>
-          </w:tcPr>
-          <w:p>
-            <w:pPr>
-              <w:spacing w:before="40" w:after="40" w:line="240" w:lineRule="exact"/>
-              <w:jc w:val="left"/>
-            </w:pPr>
-            <w:r/>
-            <w:r>
-              <w:rPr>
-                <w:rFonts w:ascii="Times New Roman" w:hAnsi="Times New Roman" w:eastAsia="Times New Roman"/>
-                <w:b w:val="0"/>
-                <w:i w:val="0"/>
-                <w:color w:val="000000"/>
-                <w:sz w:val="18"/>
-              </w:rPr>
-              <w:t>All participants</w:t>
-            </w:r>
-          </w:p>
-        </w:tc>
-        <w:tc>
-          <w:tcPr>
-            <w:tcW w:type="dxa" w:w="4680"/>
-            <w:shd w:fill="FFFFFF" w:val="clear"/>
-          </w:tcPr>
-          <w:p>
-            <w:pPr>
-              <w:spacing w:before="40" w:after="40" w:line="240" w:lineRule="exact"/>
-              <w:jc w:val="left"/>
-            </w:pPr>
-            <w:r/>
-            <w:r>
-              <w:rPr>
-                <w:rFonts w:ascii="Times New Roman" w:hAnsi="Times New Roman" w:eastAsia="Times New Roman"/>
-                <w:b w:val="0"/>
-                <w:i w:val="0"/>
-                <w:color w:val="000000"/>
-                <w:sz w:val="18"/>
-              </w:rPr>
-              <w:t>Five-minute walkthrough of ESP32, Blynk, Telegram, and LEDs</w:t>
-            </w:r>
-          </w:p>
-        </w:tc>
-      </w:tr>
-    </w:tbl>
-    <w:p/>
-    <w:p>
-      <w:pPr>
         <w:spacing w:before="0" w:after="160" w:line="320" w:lineRule="exact"/>
         <w:jc w:val="both"/>
       </w:pPr>
@@ -3425,226 +595,6 @@
         <w:t>One staff member initially pressed V7 twice in rapid succession. The mistake was handled immediately during training by repeating the one-press-per-departure instruction. The 60-second cooldown applied to Telegram alerts and did not function as a lockout for the V7 button. One commuter initially confused the red LED with a fire alarm; however, the meaning of the indicator was clarified within seconds. These observations demonstrated the importance of brief operational instructions and clear on-device labels.</w:t>
       </w:r>
     </w:p>
-    <w:p>
-      <w:pPr>
-        <w:spacing w:before="160" w:after="120" w:line="280" w:lineRule="exact"/>
-        <w:jc w:val="center"/>
-      </w:pPr>
-      <w:r>
-        <w:rPr>
-          <w:rFonts w:ascii="Times New Roman" w:hAnsi="Times New Roman" w:eastAsia="Times New Roman"/>
-          <w:b/>
-          <w:i w:val="0"/>
-          <w:sz w:val="22"/>
-        </w:rPr>
-        <w:t>Table 6.9: Training Issues and Corrections</w:t>
-      </w:r>
-    </w:p>
-    <w:tbl>
-      <w:tblPr>
-        <w:tblStyle w:val="TableGrid"/>
-        <w:tblW w:type="auto" w:w="0"/>
-        <w:jc w:val="center"/>
-        <w:tblLook w:firstColumn="1" w:firstRow="1" w:lastColumn="0" w:lastRow="0" w:noHBand="0" w:noVBand="1" w:val="04A0"/>
-      </w:tblPr>
-      <w:tblGrid>
-        <w:gridCol w:w="4680"/>
-        <w:gridCol w:w="4680"/>
-      </w:tblGrid>
-      <w:tr>
-        <w:tc>
-          <w:tcPr>
-            <w:tcW w:type="dxa" w:w="4680"/>
-            <w:shd w:fill="1F4E79" w:val="clear"/>
-          </w:tcPr>
-          <w:p>
-            <w:pPr>
-              <w:spacing w:before="40" w:after="40" w:line="240" w:lineRule="exact"/>
-              <w:jc w:val="center"/>
-            </w:pPr>
-            <w:r/>
-            <w:r>
-              <w:rPr>
-                <w:rFonts w:ascii="Times New Roman" w:hAnsi="Times New Roman" w:eastAsia="Times New Roman"/>
-                <w:b/>
-                <w:i w:val="0"/>
-                <w:color w:val="FFFFFF"/>
-                <w:sz w:val="18"/>
-              </w:rPr>
-              <w:t>Issue observed in training</w:t>
-            </w:r>
-          </w:p>
-        </w:tc>
-        <w:tc>
-          <w:tcPr>
-            <w:tcW w:type="dxa" w:w="4680"/>
-            <w:shd w:fill="1F4E79" w:val="clear"/>
-          </w:tcPr>
-          <w:p>
-            <w:pPr>
-              <w:spacing w:before="40" w:after="40" w:line="240" w:lineRule="exact"/>
-              <w:jc w:val="center"/>
-            </w:pPr>
-            <w:r/>
-            <w:r>
-              <w:rPr>
-                <w:rFonts w:ascii="Times New Roman" w:hAnsi="Times New Roman" w:eastAsia="Times New Roman"/>
-                <w:b/>
-                <w:i w:val="0"/>
-                <w:color w:val="FFFFFF"/>
-                <w:sz w:val="18"/>
-              </w:rPr>
-              <w:t>Correction</w:t>
-            </w:r>
-          </w:p>
-        </w:tc>
-      </w:tr>
-      <w:tr>
-        <w:tc>
-          <w:tcPr>
-            <w:tcW w:type="dxa" w:w="4680"/>
-            <w:shd w:fill="FFFFFF" w:val="clear"/>
-          </w:tcPr>
-          <w:p>
-            <w:pPr>
-              <w:spacing w:before="40" w:after="40" w:line="240" w:lineRule="exact"/>
-              <w:jc w:val="left"/>
-            </w:pPr>
-            <w:r/>
-            <w:r>
-              <w:rPr>
-                <w:rFonts w:ascii="Times New Roman" w:hAnsi="Times New Roman" w:eastAsia="Times New Roman"/>
-                <w:b w:val="0"/>
-                <w:i w:val="0"/>
-                <w:color w:val="000000"/>
-                <w:sz w:val="18"/>
-              </w:rPr>
-              <w:t>Staff member pressed V7 twice in rapid succession</w:t>
-            </w:r>
-          </w:p>
-        </w:tc>
-        <w:tc>
-          <w:tcPr>
-            <w:tcW w:type="dxa" w:w="4680"/>
-            <w:shd w:fill="FFFFFF" w:val="clear"/>
-          </w:tcPr>
-          <w:p>
-            <w:pPr>
-              <w:spacing w:before="40" w:after="40" w:line="240" w:lineRule="exact"/>
-              <w:jc w:val="left"/>
-            </w:pPr>
-            <w:r/>
-            <w:r>
-              <w:rPr>
-                <w:rFonts w:ascii="Times New Roman" w:hAnsi="Times New Roman" w:eastAsia="Times New Roman"/>
-                <w:b w:val="0"/>
-                <w:i w:val="0"/>
-                <w:color w:val="000000"/>
-                <w:sz w:val="18"/>
-              </w:rPr>
-              <w:t>Repeated one-press-per-departure rule</w:t>
-            </w:r>
-          </w:p>
-        </w:tc>
-      </w:tr>
-      <w:tr>
-        <w:tc>
-          <w:tcPr>
-            <w:tcW w:type="dxa" w:w="4680"/>
-            <w:shd w:fill="F2F2F2" w:val="clear"/>
-          </w:tcPr>
-          <w:p>
-            <w:pPr>
-              <w:spacing w:before="40" w:after="40" w:line="240" w:lineRule="exact"/>
-              <w:jc w:val="left"/>
-            </w:pPr>
-            <w:r/>
-            <w:r>
-              <w:rPr>
-                <w:rFonts w:ascii="Times New Roman" w:hAnsi="Times New Roman" w:eastAsia="Times New Roman"/>
-                <w:b w:val="0"/>
-                <w:i w:val="0"/>
-                <w:color w:val="000000"/>
-                <w:sz w:val="18"/>
-              </w:rPr>
-              <w:t>Commuter confused red LED with a fire alarm</w:t>
-            </w:r>
-          </w:p>
-        </w:tc>
-        <w:tc>
-          <w:tcPr>
-            <w:tcW w:type="dxa" w:w="4680"/>
-            <w:shd w:fill="F2F2F2" w:val="clear"/>
-          </w:tcPr>
-          <w:p>
-            <w:pPr>
-              <w:spacing w:before="40" w:after="40" w:line="240" w:lineRule="exact"/>
-              <w:jc w:val="left"/>
-            </w:pPr>
-            <w:r/>
-            <w:r>
-              <w:rPr>
-                <w:rFonts w:ascii="Times New Roman" w:hAnsi="Times New Roman" w:eastAsia="Times New Roman"/>
-                <w:b w:val="0"/>
-                <w:i w:val="0"/>
-                <w:color w:val="000000"/>
-                <w:sz w:val="18"/>
-              </w:rPr>
-              <w:t>Meaning clarified within seconds; labels emphasised</w:t>
-            </w:r>
-          </w:p>
-        </w:tc>
-      </w:tr>
-      <w:tr>
-        <w:tc>
-          <w:tcPr>
-            <w:tcW w:type="dxa" w:w="4680"/>
-            <w:shd w:fill="FFFFFF" w:val="clear"/>
-          </w:tcPr>
-          <w:p>
-            <w:pPr>
-              <w:spacing w:before="40" w:after="40" w:line="240" w:lineRule="exact"/>
-              <w:jc w:val="left"/>
-            </w:pPr>
-            <w:r/>
-            <w:r>
-              <w:rPr>
-                <w:rFonts w:ascii="Times New Roman" w:hAnsi="Times New Roman" w:eastAsia="Times New Roman"/>
-                <w:b w:val="0"/>
-                <w:i w:val="0"/>
-                <w:color w:val="000000"/>
-                <w:sz w:val="18"/>
-              </w:rPr>
-              <w:t>Telegram 60 s cooldown mistaken as a V7 lockout</w:t>
-            </w:r>
-          </w:p>
-        </w:tc>
-        <w:tc>
-          <w:tcPr>
-            <w:tcW w:type="dxa" w:w="4680"/>
-            <w:shd w:fill="FFFFFF" w:val="clear"/>
-          </w:tcPr>
-          <w:p>
-            <w:pPr>
-              <w:spacing w:before="40" w:after="40" w:line="240" w:lineRule="exact"/>
-              <w:jc w:val="left"/>
-            </w:pPr>
-            <w:r/>
-            <w:r>
-              <w:rPr>
-                <w:rFonts w:ascii="Times New Roman" w:hAnsi="Times New Roman" w:eastAsia="Times New Roman"/>
-                <w:b w:val="0"/>
-                <w:i w:val="0"/>
-                <w:color w:val="000000"/>
-                <w:sz w:val="18"/>
-              </w:rPr>
-              <w:t>Clarified that cooldown applies only to Telegram alerts</w:t>
-            </w:r>
-          </w:p>
-        </w:tc>
-      </w:tr>
-    </w:tbl>
-    <w:p/>
     <w:p>
       <w:pPr>
         <w:spacing w:before="280" w:after="160" w:line="320" w:lineRule="exact"/>
@@ -3672,181 +622,9 @@
           <w:i w:val="0"/>
           <w:sz w:val="24"/>
         </w:rPr>
-        <w:t>Feedback was collected using a digital form [13] and a physical notebook during in-person conversations. The two methods allowed participants to provide structured ratings as well as short comments about usability, trust, operational value, and desired improvements.</w:t>
+        <w:t>Feedback was collected using a digital form and a physical notebook during in-person conversations. The two methods allowed participants to provide structured ratings as well as short comments about usability, trust, operational value, and desired improvements.</w:t>
       </w:r>
     </w:p>
-    <w:p>
-      <w:pPr>
-        <w:spacing w:before="160" w:after="120" w:line="280" w:lineRule="exact"/>
-        <w:jc w:val="center"/>
-      </w:pPr>
-      <w:r>
-        <w:rPr>
-          <w:rFonts w:ascii="Times New Roman" w:hAnsi="Times New Roman" w:eastAsia="Times New Roman"/>
-          <w:b/>
-          <w:i w:val="0"/>
-          <w:sz w:val="22"/>
-        </w:rPr>
-        <w:t>Table 6.10: Feedback Collection Methods</w:t>
-      </w:r>
-    </w:p>
-    <w:tbl>
-      <w:tblPr>
-        <w:tblStyle w:val="TableGrid"/>
-        <w:tblW w:type="auto" w:w="0"/>
-        <w:jc w:val="center"/>
-        <w:tblLook w:firstColumn="1" w:firstRow="1" w:lastColumn="0" w:lastRow="0" w:noHBand="0" w:noVBand="1" w:val="04A0"/>
-      </w:tblPr>
-      <w:tblGrid>
-        <w:gridCol w:w="4680"/>
-        <w:gridCol w:w="4680"/>
-      </w:tblGrid>
-      <w:tr>
-        <w:tc>
-          <w:tcPr>
-            <w:tcW w:type="dxa" w:w="4680"/>
-            <w:shd w:fill="1F4E79" w:val="clear"/>
-          </w:tcPr>
-          <w:p>
-            <w:pPr>
-              <w:spacing w:before="40" w:after="40" w:line="240" w:lineRule="exact"/>
-              <w:jc w:val="center"/>
-            </w:pPr>
-            <w:r/>
-            <w:r>
-              <w:rPr>
-                <w:rFonts w:ascii="Times New Roman" w:hAnsi="Times New Roman" w:eastAsia="Times New Roman"/>
-                <w:b/>
-                <w:i w:val="0"/>
-                <w:color w:val="FFFFFF"/>
-                <w:sz w:val="18"/>
-              </w:rPr>
-              <w:t>Method</w:t>
-            </w:r>
-          </w:p>
-        </w:tc>
-        <w:tc>
-          <w:tcPr>
-            <w:tcW w:type="dxa" w:w="4680"/>
-            <w:shd w:fill="1F4E79" w:val="clear"/>
-          </w:tcPr>
-          <w:p>
-            <w:pPr>
-              <w:spacing w:before="40" w:after="40" w:line="240" w:lineRule="exact"/>
-              <w:jc w:val="center"/>
-            </w:pPr>
-            <w:r/>
-            <w:r>
-              <w:rPr>
-                <w:rFonts w:ascii="Times New Roman" w:hAnsi="Times New Roman" w:eastAsia="Times New Roman"/>
-                <w:b/>
-                <w:i w:val="0"/>
-                <w:color w:val="FFFFFF"/>
-                <w:sz w:val="18"/>
-              </w:rPr>
-              <w:t>What it captured</w:t>
-            </w:r>
-          </w:p>
-        </w:tc>
-      </w:tr>
-      <w:tr>
-        <w:tc>
-          <w:tcPr>
-            <w:tcW w:type="dxa" w:w="4680"/>
-            <w:shd w:fill="FFFFFF" w:val="clear"/>
-          </w:tcPr>
-          <w:p>
-            <w:pPr>
-              <w:spacing w:before="40" w:after="40" w:line="240" w:lineRule="exact"/>
-              <w:jc w:val="left"/>
-            </w:pPr>
-            <w:r/>
-            <w:r>
-              <w:rPr>
-                <w:rFonts w:ascii="Times New Roman" w:hAnsi="Times New Roman" w:eastAsia="Times New Roman"/>
-                <w:b w:val="0"/>
-                <w:i w:val="0"/>
-                <w:color w:val="000000"/>
-                <w:sz w:val="18"/>
-              </w:rPr>
-              <w:t>Digital form [13]</w:t>
-            </w:r>
-          </w:p>
-        </w:tc>
-        <w:tc>
-          <w:tcPr>
-            <w:tcW w:type="dxa" w:w="4680"/>
-            <w:shd w:fill="FFFFFF" w:val="clear"/>
-          </w:tcPr>
-          <w:p>
-            <w:pPr>
-              <w:spacing w:before="40" w:after="40" w:line="240" w:lineRule="exact"/>
-              <w:jc w:val="left"/>
-            </w:pPr>
-            <w:r/>
-            <w:r>
-              <w:rPr>
-                <w:rFonts w:ascii="Times New Roman" w:hAnsi="Times New Roman" w:eastAsia="Times New Roman"/>
-                <w:b w:val="0"/>
-                <w:i w:val="0"/>
-                <w:color w:val="000000"/>
-                <w:sz w:val="18"/>
-              </w:rPr>
-              <w:t>Structured ratings on ease, trust, Telegram usefulness, overall score</w:t>
-            </w:r>
-          </w:p>
-        </w:tc>
-      </w:tr>
-      <w:tr>
-        <w:tc>
-          <w:tcPr>
-            <w:tcW w:type="dxa" w:w="4680"/>
-            <w:shd w:fill="F2F2F2" w:val="clear"/>
-          </w:tcPr>
-          <w:p>
-            <w:pPr>
-              <w:spacing w:before="40" w:after="40" w:line="240" w:lineRule="exact"/>
-              <w:jc w:val="left"/>
-            </w:pPr>
-            <w:r/>
-            <w:r>
-              <w:rPr>
-                <w:rFonts w:ascii="Times New Roman" w:hAnsi="Times New Roman" w:eastAsia="Times New Roman"/>
-                <w:b w:val="0"/>
-                <w:i w:val="0"/>
-                <w:color w:val="000000"/>
-                <w:sz w:val="18"/>
-              </w:rPr>
-              <w:t>Physical notebook</w:t>
-            </w:r>
-          </w:p>
-        </w:tc>
-        <w:tc>
-          <w:tcPr>
-            <w:tcW w:type="dxa" w:w="4680"/>
-            <w:shd w:fill="F2F2F2" w:val="clear"/>
-          </w:tcPr>
-          <w:p>
-            <w:pPr>
-              <w:spacing w:before="40" w:after="40" w:line="240" w:lineRule="exact"/>
-              <w:jc w:val="left"/>
-            </w:pPr>
-            <w:r/>
-            <w:r>
-              <w:rPr>
-                <w:rFonts w:ascii="Times New Roman" w:hAnsi="Times New Roman" w:eastAsia="Times New Roman"/>
-                <w:b w:val="0"/>
-                <w:i w:val="0"/>
-                <w:color w:val="000000"/>
-                <w:sz w:val="18"/>
-              </w:rPr>
-              <w:t>Short in-person comments on usability and improvements</w:t>
-            </w:r>
-          </w:p>
-        </w:tc>
-      </w:tr>
-    </w:tbl>
-    <w:p/>
     <w:p>
       <w:pPr>
         <w:spacing w:before="0" w:after="160" w:line="320" w:lineRule="exact"/>
@@ -3862,322 +640,6 @@
         <w:t>Participants were asked how easy the system was to understand, whether they would trust the red and green LED indicators, how useful the Telegram alert was for their workflow, how they would rate the overall system, and what they would improve. The questions were kept short and plain so that all participants could respond without technical knowledge.</w:t>
       </w:r>
     </w:p>
-    <w:p>
-      <w:pPr>
-        <w:spacing w:before="160" w:after="120" w:line="280" w:lineRule="exact"/>
-        <w:jc w:val="center"/>
-      </w:pPr>
-      <w:r>
-        <w:rPr>
-          <w:rFonts w:ascii="Times New Roman" w:hAnsi="Times New Roman" w:eastAsia="Times New Roman"/>
-          <w:b/>
-          <w:i w:val="0"/>
-          <w:sz w:val="22"/>
-        </w:rPr>
-        <w:t>Table 6.11: Feedback Questions</w:t>
-      </w:r>
-    </w:p>
-    <w:tbl>
-      <w:tblPr>
-        <w:tblStyle w:val="TableGrid"/>
-        <w:tblW w:type="auto" w:w="0"/>
-        <w:jc w:val="center"/>
-        <w:tblLook w:firstColumn="1" w:firstRow="1" w:lastColumn="0" w:lastRow="0" w:noHBand="0" w:noVBand="1" w:val="04A0"/>
-      </w:tblPr>
-      <w:tblGrid>
-        <w:gridCol w:w="4680"/>
-        <w:gridCol w:w="4680"/>
-      </w:tblGrid>
-      <w:tr>
-        <w:tc>
-          <w:tcPr>
-            <w:tcW w:type="dxa" w:w="4680"/>
-            <w:shd w:fill="1F4E79" w:val="clear"/>
-          </w:tcPr>
-          <w:p>
-            <w:pPr>
-              <w:spacing w:before="40" w:after="40" w:line="240" w:lineRule="exact"/>
-              <w:jc w:val="center"/>
-            </w:pPr>
-            <w:r/>
-            <w:r>
-              <w:rPr>
-                <w:rFonts w:ascii="Times New Roman" w:hAnsi="Times New Roman" w:eastAsia="Times New Roman"/>
-                <w:b/>
-                <w:i w:val="0"/>
-                <w:color w:val="FFFFFF"/>
-                <w:sz w:val="18"/>
-              </w:rPr>
-              <w:t>No.</w:t>
-            </w:r>
-          </w:p>
-        </w:tc>
-        <w:tc>
-          <w:tcPr>
-            <w:tcW w:type="dxa" w:w="4680"/>
-            <w:shd w:fill="1F4E79" w:val="clear"/>
-          </w:tcPr>
-          <w:p>
-            <w:pPr>
-              <w:spacing w:before="40" w:after="40" w:line="240" w:lineRule="exact"/>
-              <w:jc w:val="center"/>
-            </w:pPr>
-            <w:r/>
-            <w:r>
-              <w:rPr>
-                <w:rFonts w:ascii="Times New Roman" w:hAnsi="Times New Roman" w:eastAsia="Times New Roman"/>
-                <w:b/>
-                <w:i w:val="0"/>
-                <w:color w:val="FFFFFF"/>
-                <w:sz w:val="18"/>
-              </w:rPr>
-              <w:t>Question theme</w:t>
-            </w:r>
-          </w:p>
-        </w:tc>
-      </w:tr>
-      <w:tr>
-        <w:tc>
-          <w:tcPr>
-            <w:tcW w:type="dxa" w:w="4680"/>
-            <w:shd w:fill="FFFFFF" w:val="clear"/>
-          </w:tcPr>
-          <w:p>
-            <w:pPr>
-              <w:spacing w:before="40" w:after="40" w:line="240" w:lineRule="exact"/>
-              <w:jc w:val="left"/>
-            </w:pPr>
-            <w:r/>
-            <w:r>
-              <w:rPr>
-                <w:rFonts w:ascii="Times New Roman" w:hAnsi="Times New Roman" w:eastAsia="Times New Roman"/>
-                <w:b w:val="0"/>
-                <w:i w:val="0"/>
-                <w:color w:val="000000"/>
-                <w:sz w:val="18"/>
-              </w:rPr>
-              <w:t>1</w:t>
-            </w:r>
-          </w:p>
-        </w:tc>
-        <w:tc>
-          <w:tcPr>
-            <w:tcW w:type="dxa" w:w="4680"/>
-            <w:shd w:fill="FFFFFF" w:val="clear"/>
-          </w:tcPr>
-          <w:p>
-            <w:pPr>
-              <w:spacing w:before="40" w:after="40" w:line="240" w:lineRule="exact"/>
-              <w:jc w:val="left"/>
-            </w:pPr>
-            <w:r/>
-            <w:r>
-              <w:rPr>
-                <w:rFonts w:ascii="Times New Roman" w:hAnsi="Times New Roman" w:eastAsia="Times New Roman"/>
-                <w:b w:val="0"/>
-                <w:i w:val="0"/>
-                <w:color w:val="000000"/>
-                <w:sz w:val="18"/>
-              </w:rPr>
-              <w:t>How easy the system was to understand</w:t>
-            </w:r>
-          </w:p>
-        </w:tc>
-      </w:tr>
-      <w:tr>
-        <w:tc>
-          <w:tcPr>
-            <w:tcW w:type="dxa" w:w="4680"/>
-            <w:shd w:fill="F2F2F2" w:val="clear"/>
-          </w:tcPr>
-          <w:p>
-            <w:pPr>
-              <w:spacing w:before="40" w:after="40" w:line="240" w:lineRule="exact"/>
-              <w:jc w:val="left"/>
-            </w:pPr>
-            <w:r/>
-            <w:r>
-              <w:rPr>
-                <w:rFonts w:ascii="Times New Roman" w:hAnsi="Times New Roman" w:eastAsia="Times New Roman"/>
-                <w:b w:val="0"/>
-                <w:i w:val="0"/>
-                <w:color w:val="000000"/>
-                <w:sz w:val="18"/>
-              </w:rPr>
-              <w:t>2</w:t>
-            </w:r>
-          </w:p>
-        </w:tc>
-        <w:tc>
-          <w:tcPr>
-            <w:tcW w:type="dxa" w:w="4680"/>
-            <w:shd w:fill="F2F2F2" w:val="clear"/>
-          </w:tcPr>
-          <w:p>
-            <w:pPr>
-              <w:spacing w:before="40" w:after="40" w:line="240" w:lineRule="exact"/>
-              <w:jc w:val="left"/>
-            </w:pPr>
-            <w:r/>
-            <w:r>
-              <w:rPr>
-                <w:rFonts w:ascii="Times New Roman" w:hAnsi="Times New Roman" w:eastAsia="Times New Roman"/>
-                <w:b w:val="0"/>
-                <w:i w:val="0"/>
-                <w:color w:val="000000"/>
-                <w:sz w:val="18"/>
-              </w:rPr>
-              <w:t>Whether they would trust the red and green LED indicators</w:t>
-            </w:r>
-          </w:p>
-        </w:tc>
-      </w:tr>
-      <w:tr>
-        <w:tc>
-          <w:tcPr>
-            <w:tcW w:type="dxa" w:w="4680"/>
-            <w:shd w:fill="FFFFFF" w:val="clear"/>
-          </w:tcPr>
-          <w:p>
-            <w:pPr>
-              <w:spacing w:before="40" w:after="40" w:line="240" w:lineRule="exact"/>
-              <w:jc w:val="left"/>
-            </w:pPr>
-            <w:r/>
-            <w:r>
-              <w:rPr>
-                <w:rFonts w:ascii="Times New Roman" w:hAnsi="Times New Roman" w:eastAsia="Times New Roman"/>
-                <w:b w:val="0"/>
-                <w:i w:val="0"/>
-                <w:color w:val="000000"/>
-                <w:sz w:val="18"/>
-              </w:rPr>
-              <w:t>3</w:t>
-            </w:r>
-          </w:p>
-        </w:tc>
-        <w:tc>
-          <w:tcPr>
-            <w:tcW w:type="dxa" w:w="4680"/>
-            <w:shd w:fill="FFFFFF" w:val="clear"/>
-          </w:tcPr>
-          <w:p>
-            <w:pPr>
-              <w:spacing w:before="40" w:after="40" w:line="240" w:lineRule="exact"/>
-              <w:jc w:val="left"/>
-            </w:pPr>
-            <w:r/>
-            <w:r>
-              <w:rPr>
-                <w:rFonts w:ascii="Times New Roman" w:hAnsi="Times New Roman" w:eastAsia="Times New Roman"/>
-                <w:b w:val="0"/>
-                <w:i w:val="0"/>
-                <w:color w:val="000000"/>
-                <w:sz w:val="18"/>
-              </w:rPr>
-              <w:t>How useful the Telegram alert was for their workflow</w:t>
-            </w:r>
-          </w:p>
-        </w:tc>
-      </w:tr>
-      <w:tr>
-        <w:tc>
-          <w:tcPr>
-            <w:tcW w:type="dxa" w:w="4680"/>
-            <w:shd w:fill="F2F2F2" w:val="clear"/>
-          </w:tcPr>
-          <w:p>
-            <w:pPr>
-              <w:spacing w:before="40" w:after="40" w:line="240" w:lineRule="exact"/>
-              <w:jc w:val="left"/>
-            </w:pPr>
-            <w:r/>
-            <w:r>
-              <w:rPr>
-                <w:rFonts w:ascii="Times New Roman" w:hAnsi="Times New Roman" w:eastAsia="Times New Roman"/>
-                <w:b w:val="0"/>
-                <w:i w:val="0"/>
-                <w:color w:val="000000"/>
-                <w:sz w:val="18"/>
-              </w:rPr>
-              <w:t>4</w:t>
-            </w:r>
-          </w:p>
-        </w:tc>
-        <w:tc>
-          <w:tcPr>
-            <w:tcW w:type="dxa" w:w="4680"/>
-            <w:shd w:fill="F2F2F2" w:val="clear"/>
-          </w:tcPr>
-          <w:p>
-            <w:pPr>
-              <w:spacing w:before="40" w:after="40" w:line="240" w:lineRule="exact"/>
-              <w:jc w:val="left"/>
-            </w:pPr>
-            <w:r/>
-            <w:r>
-              <w:rPr>
-                <w:rFonts w:ascii="Times New Roman" w:hAnsi="Times New Roman" w:eastAsia="Times New Roman"/>
-                <w:b w:val="0"/>
-                <w:i w:val="0"/>
-                <w:color w:val="000000"/>
-                <w:sz w:val="18"/>
-              </w:rPr>
-              <w:t>Overall system rating</w:t>
-            </w:r>
-          </w:p>
-        </w:tc>
-      </w:tr>
-      <w:tr>
-        <w:tc>
-          <w:tcPr>
-            <w:tcW w:type="dxa" w:w="4680"/>
-            <w:shd w:fill="FFFFFF" w:val="clear"/>
-          </w:tcPr>
-          <w:p>
-            <w:pPr>
-              <w:spacing w:before="40" w:after="40" w:line="240" w:lineRule="exact"/>
-              <w:jc w:val="left"/>
-            </w:pPr>
-            <w:r/>
-            <w:r>
-              <w:rPr>
-                <w:rFonts w:ascii="Times New Roman" w:hAnsi="Times New Roman" w:eastAsia="Times New Roman"/>
-                <w:b w:val="0"/>
-                <w:i w:val="0"/>
-                <w:color w:val="000000"/>
-                <w:sz w:val="18"/>
-              </w:rPr>
-              <w:t>5</w:t>
-            </w:r>
-          </w:p>
-        </w:tc>
-        <w:tc>
-          <w:tcPr>
-            <w:tcW w:type="dxa" w:w="4680"/>
-            <w:shd w:fill="FFFFFF" w:val="clear"/>
-          </w:tcPr>
-          <w:p>
-            <w:pPr>
-              <w:spacing w:before="40" w:after="40" w:line="240" w:lineRule="exact"/>
-              <w:jc w:val="left"/>
-            </w:pPr>
-            <w:r/>
-            <w:r>
-              <w:rPr>
-                <w:rFonts w:ascii="Times New Roman" w:hAnsi="Times New Roman" w:eastAsia="Times New Roman"/>
-                <w:b w:val="0"/>
-                <w:i w:val="0"/>
-                <w:color w:val="000000"/>
-                <w:sz w:val="18"/>
-              </w:rPr>
-              <w:t>What they would improve</w:t>
-            </w:r>
-          </w:p>
-        </w:tc>
-      </w:tr>
-    </w:tbl>
-    <w:p/>
     <w:p>
       <w:pPr>
         <w:spacing w:before="0" w:after="160" w:line="320" w:lineRule="exact"/>
@@ -4220,7 +682,7 @@
           <w:i w:val="0"/>
           <w:sz w:val="24"/>
         </w:rPr>
-        <w:t>The collected feedback was systematically analysed to identify repeating patterns and common opinions across the participant groups. The most frequent positive comments highlighted the simplicity of the LED indicators and the value of receiving crowding information without requiring a mobile application. Participants appreciated the immediate visual clarity of the green and red states, which required no technical knowledge to interpret.</w:t>
+        <w:t>The collected feedback [13] was systematically analysed to identify repeating patterns and common opinions across the participant groups. The most frequent positive comments highlighted the simplicity of the LED indicators and the value of receiving crowding information without requiring a mobile application. Participants appreciated the immediate visual clarity of the green and red states, which required no technical knowledge to interpret.</w:t>
       </w:r>
     </w:p>
     <w:p>
@@ -4250,7 +712,7 @@
           <w:i w:val="0"/>
           <w:sz w:val="22"/>
         </w:rPr>
-        <w:t>Table 6.12: Post-Deployment Satisfaction Rating Distribution</w:t>
+        <w:t>Table 6.2: Post-Deployment Satisfaction Rating Distribution</w:t>
       </w:r>
     </w:p>
     <w:tbl>
@@ -4274,7 +736,7 @@
           <w:p>
             <w:pPr>
               <w:spacing w:before="40" w:after="40" w:line="240" w:lineRule="exact"/>
-              <w:jc w:val="center"/>
+              <w:jc w:val="left"/>
             </w:pPr>
             <w:r/>
             <w:r>
@@ -4297,7 +759,7 @@
           <w:p>
             <w:pPr>
               <w:spacing w:before="40" w:after="40" w:line="240" w:lineRule="exact"/>
-              <w:jc w:val="center"/>
+              <w:jc w:val="left"/>
             </w:pPr>
             <w:r/>
             <w:r>
@@ -4308,7 +770,7 @@
                 <w:color w:val="FFFFFF"/>
                 <w:sz w:val="18"/>
               </w:rPr>
-              <w:t>No. of respondents</w:t>
+              <w:t>No. of Respondents</w:t>
             </w:r>
           </w:p>
         </w:tc>
@@ -4320,7 +782,7 @@
           <w:p>
             <w:pPr>
               <w:spacing w:before="40" w:after="40" w:line="240" w:lineRule="exact"/>
-              <w:jc w:val="center"/>
+              <w:jc w:val="left"/>
             </w:pPr>
             <w:r/>
             <w:r>
@@ -4875,7 +1337,7 @@
           <w:i w:val="0"/>
           <w:sz w:val="22"/>
         </w:rPr>
-        <w:t>Table 6.13: Impact Assessment</w:t>
+        <w:t>Table 6.3: Impact Assessment</w:t>
       </w:r>
     </w:p>
     <w:tbl>
@@ -4900,7 +1362,7 @@
           <w:p>
             <w:pPr>
               <w:spacing w:before="40" w:after="40" w:line="240" w:lineRule="exact"/>
-              <w:jc w:val="center"/>
+              <w:jc w:val="left"/>
             </w:pPr>
             <w:r/>
             <w:r>
@@ -4923,7 +1385,7 @@
           <w:p>
             <w:pPr>
               <w:spacing w:before="40" w:after="40" w:line="240" w:lineRule="exact"/>
-              <w:jc w:val="center"/>
+              <w:jc w:val="left"/>
             </w:pPr>
             <w:r/>
             <w:r>
@@ -4934,7 +1396,7 @@
                 <w:color w:val="FFFFFF"/>
                 <w:sz w:val="18"/>
               </w:rPr>
-              <w:t>Before deployment</w:t>
+              <w:t>Before Deployment</w:t>
             </w:r>
           </w:p>
         </w:tc>
@@ -4946,7 +1408,7 @@
           <w:p>
             <w:pPr>
               <w:spacing w:before="40" w:after="40" w:line="240" w:lineRule="exact"/>
-              <w:jc w:val="center"/>
+              <w:jc w:val="left"/>
             </w:pPr>
             <w:r/>
             <w:r>
@@ -4957,7 +1419,7 @@
                 <w:color w:val="FFFFFF"/>
                 <w:sz w:val="18"/>
               </w:rPr>
-              <w:t>After deployment</w:t>
+              <w:t>After Deployment</w:t>
             </w:r>
           </w:p>
         </w:tc>
@@ -4969,7 +1431,7 @@
           <w:p>
             <w:pPr>
               <w:spacing w:before="40" w:after="40" w:line="240" w:lineRule="exact"/>
-              <w:jc w:val="center"/>
+              <w:jc w:val="left"/>
             </w:pPr>
             <w:r/>
             <w:r>
@@ -5074,7 +1536,7 @@
                 <w:color w:val="000000"/>
                 <w:sz w:val="18"/>
               </w:rPr>
-              <w:t>Subjective to objective</w:t>
+              <w:t>Subjective to Objective</w:t>
             </w:r>
           </w:p>
         </w:tc>
@@ -5168,7 +1630,7 @@
                 <w:color w:val="000000"/>
                 <w:sz w:val="18"/>
               </w:rPr>
-              <w:t>Minutes to sub-second</w:t>
+              <w:t>Minutes to Sub-second</w:t>
             </w:r>
           </w:p>
         </w:tc>
@@ -5262,7 +1724,7 @@
                 <w:color w:val="000000"/>
                 <w:sz w:val="18"/>
               </w:rPr>
-              <w:t>None to persistent record</w:t>
+              <w:t>None to Persistent record</w:t>
             </w:r>
           </w:p>
         </w:tc>
@@ -5356,7 +1818,7 @@
                 <w:color w:val="000000"/>
                 <w:sz w:val="18"/>
               </w:rPr>
-              <w:t>None to human-in-the-loop control</w:t>
+              <w:t>None to Human-in-the-loop control</w:t>
             </w:r>
           </w:p>
         </w:tc>
@@ -5450,7 +1912,7 @@
                 <w:color w:val="000000"/>
                 <w:sz w:val="18"/>
               </w:rPr>
-              <w:t>Prohibitive to affordable</w:t>
+              <w:t>Prohibitive to Affordable</w:t>
             </w:r>
           </w:p>
         </w:tc>
@@ -5514,7 +1976,7 @@
           <w:i w:val="0"/>
           <w:sz w:val="22"/>
         </w:rPr>
-        <w:t>Table 6.14: Outcome Achievement Matrix</w:t>
+        <w:t>Table 6.4: Outcome Achievement Matrix</w:t>
       </w:r>
     </w:p>
     <w:tbl>
@@ -5538,7 +2000,7 @@
           <w:p>
             <w:pPr>
               <w:spacing w:before="40" w:after="40" w:line="240" w:lineRule="exact"/>
-              <w:jc w:val="center"/>
+              <w:jc w:val="left"/>
             </w:pPr>
             <w:r/>
             <w:r>
@@ -5549,7 +2011,7 @@
                 <w:color w:val="FFFFFF"/>
                 <w:sz w:val="18"/>
               </w:rPr>
-              <w:t>Expected outcome</w:t>
+              <w:t>Expected Outcome</w:t>
             </w:r>
           </w:p>
         </w:tc>
@@ -5561,7 +2023,7 @@
           <w:p>
             <w:pPr>
               <w:spacing w:before="40" w:after="40" w:line="240" w:lineRule="exact"/>
-              <w:jc w:val="center"/>
+              <w:jc w:val="left"/>
             </w:pPr>
             <w:r/>
             <w:r>
@@ -5584,7 +2046,7 @@
           <w:p>
             <w:pPr>
               <w:spacing w:before="40" w:after="40" w:line="240" w:lineRule="exact"/>
-              <w:jc w:val="center"/>
+              <w:jc w:val="left"/>
             </w:pPr>
             <w:r/>
             <w:r>
@@ -5808,7 +2270,7 @@
                 <w:color w:val="000000"/>
                 <w:sz w:val="18"/>
               </w:rPr>
-              <w:t>90.0% at 45 pax with rain, 65.0% at 30 pax, 15.0% at 0 pax — matches formula exactly</w:t>
+              <w:t>90.0% risk at full capacity with rain, 65.0% at 30 pax, 15.0% at 0 pax — matches formula exactly</w:t>
             </w:r>
           </w:p>
         </w:tc>
@@ -6103,226 +2565,6 @@
         <w:t>Future expansion could involve deploying additional ESP32 edge nodes at more bus stops while retaining the same layered architecture. A later version could migrate CSV storage to a cloud database such as MySQL or Firebase to support centralised multi-stop records. Solar-power integration could reduce dependence on fixed electrical connections, while an additional directional sensor could distinguish passengers entering from those leaving. These developments would improve the long-term viability of the system across Mumbai's public transport network.</w:t>
       </w:r>
     </w:p>
-    <w:p>
-      <w:pPr>
-        <w:spacing w:before="160" w:after="120" w:line="280" w:lineRule="exact"/>
-        <w:jc w:val="center"/>
-      </w:pPr>
-      <w:r>
-        <w:rPr>
-          <w:rFonts w:ascii="Times New Roman" w:hAnsi="Times New Roman" w:eastAsia="Times New Roman"/>
-          <w:b/>
-          <w:i w:val="0"/>
-          <w:sz w:val="22"/>
-        </w:rPr>
-        <w:t>Table 6.15: Sustainability Plan</w:t>
-      </w:r>
-    </w:p>
-    <w:tbl>
-      <w:tblPr>
-        <w:tblStyle w:val="TableGrid"/>
-        <w:tblW w:type="auto" w:w="0"/>
-        <w:jc w:val="center"/>
-        <w:tblLook w:firstColumn="1" w:firstRow="1" w:lastColumn="0" w:lastRow="0" w:noHBand="0" w:noVBand="1" w:val="04A0"/>
-      </w:tblPr>
-      <w:tblGrid>
-        <w:gridCol w:w="4680"/>
-        <w:gridCol w:w="4680"/>
-      </w:tblGrid>
-      <w:tr>
-        <w:tc>
-          <w:tcPr>
-            <w:tcW w:type="dxa" w:w="4680"/>
-            <w:shd w:fill="1F4E79" w:val="clear"/>
-          </w:tcPr>
-          <w:p>
-            <w:pPr>
-              <w:spacing w:before="40" w:after="40" w:line="240" w:lineRule="exact"/>
-              <w:jc w:val="center"/>
-            </w:pPr>
-            <w:r/>
-            <w:r>
-              <w:rPr>
-                <w:rFonts w:ascii="Times New Roman" w:hAnsi="Times New Roman" w:eastAsia="Times New Roman"/>
-                <w:b/>
-                <w:i w:val="0"/>
-                <w:color w:val="FFFFFF"/>
-                <w:sz w:val="18"/>
-              </w:rPr>
-              <w:t>Dimension</w:t>
-            </w:r>
-          </w:p>
-        </w:tc>
-        <w:tc>
-          <w:tcPr>
-            <w:tcW w:type="dxa" w:w="4680"/>
-            <w:shd w:fill="1F4E79" w:val="clear"/>
-          </w:tcPr>
-          <w:p>
-            <w:pPr>
-              <w:spacing w:before="40" w:after="40" w:line="240" w:lineRule="exact"/>
-              <w:jc w:val="center"/>
-            </w:pPr>
-            <w:r/>
-            <w:r>
-              <w:rPr>
-                <w:rFonts w:ascii="Times New Roman" w:hAnsi="Times New Roman" w:eastAsia="Times New Roman"/>
-                <w:b/>
-                <w:i w:val="0"/>
-                <w:color w:val="FFFFFF"/>
-                <w:sz w:val="18"/>
-              </w:rPr>
-              <w:t>How it is sustained</w:t>
-            </w:r>
-          </w:p>
-        </w:tc>
-      </w:tr>
-      <w:tr>
-        <w:tc>
-          <w:tcPr>
-            <w:tcW w:type="dxa" w:w="4680"/>
-            <w:shd w:fill="FFFFFF" w:val="clear"/>
-          </w:tcPr>
-          <w:p>
-            <w:pPr>
-              <w:spacing w:before="40" w:after="40" w:line="240" w:lineRule="exact"/>
-              <w:jc w:val="left"/>
-            </w:pPr>
-            <w:r/>
-            <w:r>
-              <w:rPr>
-                <w:rFonts w:ascii="Times New Roman" w:hAnsi="Times New Roman" w:eastAsia="Times New Roman"/>
-                <w:b w:val="0"/>
-                <w:i w:val="0"/>
-                <w:color w:val="000000"/>
-                <w:sz w:val="18"/>
-              </w:rPr>
-              <w:t>Operational</w:t>
-            </w:r>
-          </w:p>
-        </w:tc>
-        <w:tc>
-          <w:tcPr>
-            <w:tcW w:type="dxa" w:w="4680"/>
-            <w:shd w:fill="FFFFFF" w:val="clear"/>
-          </w:tcPr>
-          <w:p>
-            <w:pPr>
-              <w:spacing w:before="40" w:after="40" w:line="240" w:lineRule="exact"/>
-              <w:jc w:val="left"/>
-            </w:pPr>
-            <w:r/>
-            <w:r>
-              <w:rPr>
-                <w:rFonts w:ascii="Times New Roman" w:hAnsi="Times New Roman" w:eastAsia="Times New Roman"/>
-                <w:b w:val="0"/>
-                <w:i w:val="0"/>
-                <w:color w:val="000000"/>
-                <w:sz w:val="18"/>
-              </w:rPr>
-              <w:t>Low daily maintenance; replace VL53L0X, DHT22, or LEDs on the 3.3 V modular rail</w:t>
-            </w:r>
-          </w:p>
-        </w:tc>
-      </w:tr>
-      <w:tr>
-        <w:tc>
-          <w:tcPr>
-            <w:tcW w:type="dxa" w:w="4680"/>
-            <w:shd w:fill="F2F2F2" w:val="clear"/>
-          </w:tcPr>
-          <w:p>
-            <w:pPr>
-              <w:spacing w:before="40" w:after="40" w:line="240" w:lineRule="exact"/>
-              <w:jc w:val="left"/>
-            </w:pPr>
-            <w:r/>
-            <w:r>
-              <w:rPr>
-                <w:rFonts w:ascii="Times New Roman" w:hAnsi="Times New Roman" w:eastAsia="Times New Roman"/>
-                <w:b w:val="0"/>
-                <w:i w:val="0"/>
-                <w:color w:val="000000"/>
-                <w:sz w:val="18"/>
-              </w:rPr>
-              <w:t>Technical</w:t>
-            </w:r>
-          </w:p>
-        </w:tc>
-        <w:tc>
-          <w:tcPr>
-            <w:tcW w:type="dxa" w:w="4680"/>
-            <w:shd w:fill="F2F2F2" w:val="clear"/>
-          </w:tcPr>
-          <w:p>
-            <w:pPr>
-              <w:spacing w:before="40" w:after="40" w:line="240" w:lineRule="exact"/>
-              <w:jc w:val="left"/>
-            </w:pPr>
-            <w:r/>
-            <w:r>
-              <w:rPr>
-                <w:rFonts w:ascii="Times New Roman" w:hAnsi="Times New Roman" w:eastAsia="Times New Roman"/>
-                <w:b w:val="0"/>
-                <w:i w:val="0"/>
-                <w:color w:val="000000"/>
-                <w:sz w:val="18"/>
-              </w:rPr>
-              <w:t>Open-source Python/Arduino, documented pins and thresholds, CSV log for later retraining</w:t>
-            </w:r>
-          </w:p>
-        </w:tc>
-      </w:tr>
-      <w:tr>
-        <w:tc>
-          <w:tcPr>
-            <w:tcW w:type="dxa" w:w="4680"/>
-            <w:shd w:fill="FFFFFF" w:val="clear"/>
-          </w:tcPr>
-          <w:p>
-            <w:pPr>
-              <w:spacing w:before="40" w:after="40" w:line="240" w:lineRule="exact"/>
-              <w:jc w:val="left"/>
-            </w:pPr>
-            <w:r/>
-            <w:r>
-              <w:rPr>
-                <w:rFonts w:ascii="Times New Roman" w:hAnsi="Times New Roman" w:eastAsia="Times New Roman"/>
-                <w:b w:val="0"/>
-                <w:i w:val="0"/>
-                <w:color w:val="000000"/>
-                <w:sz w:val="18"/>
-              </w:rPr>
-              <w:t>Future expansion</w:t>
-            </w:r>
-          </w:p>
-        </w:tc>
-        <w:tc>
-          <w:tcPr>
-            <w:tcW w:type="dxa" w:w="4680"/>
-            <w:shd w:fill="FFFFFF" w:val="clear"/>
-          </w:tcPr>
-          <w:p>
-            <w:pPr>
-              <w:spacing w:before="40" w:after="40" w:line="240" w:lineRule="exact"/>
-              <w:jc w:val="left"/>
-            </w:pPr>
-            <w:r/>
-            <w:r>
-              <w:rPr>
-                <w:rFonts w:ascii="Times New Roman" w:hAnsi="Times New Roman" w:eastAsia="Times New Roman"/>
-                <w:b w:val="0"/>
-                <w:i w:val="0"/>
-                <w:color w:val="000000"/>
-                <w:sz w:val="18"/>
-              </w:rPr>
-              <w:t>More ESP32 nodes, MySQL/Firebase, solar power, second directional sensor</w:t>
-            </w:r>
-          </w:p>
-        </w:tc>
-      </w:tr>
-    </w:tbl>
-    <w:p/>
     <w:sectPr>
       <w:headerReference w:type="default" r:id="rId9"/>
       <w:footerReference w:type="default" r:id="rId10"/>

</xml_diff>

<commit_message>
Remove blue fills from Chapter 6 and 7 tables.
Table headers and cells now print white with black text so Table 6.1 and the rest match a plain grid.

Co-authored-by: omkeluskar <omkeluskar@users.noreply.github.com>
</commit_message>
<xml_diff>
--- a/cep-iot-bus-stop/chapters/Chapter_6_Community_Deployment_and_Impact_Assessment.docx
+++ b/cep-iot-bus-stop/chapters/Chapter_6_Community_Deployment_and_Impact_Assessment.docx
@@ -244,10 +244,17 @@
     </w:p>
     <w:tbl>
       <w:tblPr>
-        <w:tblStyle w:val="TableGrid"/>
         <w:tblW w:type="auto" w:w="0"/>
         <w:jc w:val="center"/>
-        <w:tblLook w:firstColumn="1" w:firstRow="1" w:lastColumn="0" w:lastRow="0" w:noHBand="0" w:noVBand="1" w:val="04A0"/>
+        <w:tblBorders>
+          <w:top w:val="single" w:sz="4" w:space="0" w:color="000000"/>
+          <w:left w:val="single" w:sz="4" w:space="0" w:color="000000"/>
+          <w:bottom w:val="single" w:sz="4" w:space="0" w:color="000000"/>
+          <w:right w:val="single" w:sz="4" w:space="0" w:color="000000"/>
+          <w:insideH w:val="single" w:sz="4" w:space="0" w:color="000000"/>
+          <w:insideV w:val="single" w:sz="4" w:space="0" w:color="000000"/>
+        </w:tblBorders>
+        <w:tblLook w:firstRow="0" w:lastRow="0" w:firstColumn="0" w:lastColumn="0" w:noHBand="1" w:noVBand="1"/>
       </w:tblPr>
       <w:tblGrid>
         <w:gridCol w:w="2340"/>
@@ -259,7 +266,7 @@
         <w:tc>
           <w:tcPr>
             <w:tcW w:type="dxa" w:w="2340"/>
-            <w:shd w:fill="1F4E79" w:val="clear"/>
+            <w:shd w:val="clear" w:color="auto" w:fill="FFFFFF"/>
           </w:tcPr>
           <w:p>
             <w:pPr>
@@ -272,7 +279,7 @@
                 <w:rFonts w:ascii="Times New Roman" w:hAnsi="Times New Roman" w:eastAsia="Times New Roman"/>
                 <w:b/>
                 <w:i w:val="0"/>
-                <w:color w:val="FFFFFF"/>
+                <w:color w:val="000000"/>
                 <w:sz w:val="18"/>
               </w:rPr>
               <w:t>Location</w:t>
@@ -282,7 +289,7 @@
         <w:tc>
           <w:tcPr>
             <w:tcW w:type="dxa" w:w="2340"/>
-            <w:shd w:fill="1F4E79" w:val="clear"/>
+            <w:shd w:val="clear" w:color="auto" w:fill="FFFFFF"/>
           </w:tcPr>
           <w:p>
             <w:pPr>
@@ -295,7 +302,7 @@
                 <w:rFonts w:ascii="Times New Roman" w:hAnsi="Times New Roman" w:eastAsia="Times New Roman"/>
                 <w:b/>
                 <w:i w:val="0"/>
-                <w:color w:val="FFFFFF"/>
+                <w:color w:val="000000"/>
                 <w:sz w:val="18"/>
               </w:rPr>
               <w:t>Date/Duration</w:t>
@@ -305,7 +312,7 @@
         <w:tc>
           <w:tcPr>
             <w:tcW w:type="dxa" w:w="2340"/>
-            <w:shd w:fill="1F4E79" w:val="clear"/>
+            <w:shd w:val="clear" w:color="auto" w:fill="FFFFFF"/>
           </w:tcPr>
           <w:p>
             <w:pPr>
@@ -318,7 +325,7 @@
                 <w:rFonts w:ascii="Times New Roman" w:hAnsi="Times New Roman" w:eastAsia="Times New Roman"/>
                 <w:b/>
                 <w:i w:val="0"/>
-                <w:color w:val="FFFFFF"/>
+                <w:color w:val="000000"/>
                 <w:sz w:val="18"/>
               </w:rPr>
               <w:t>Participants</w:t>
@@ -328,7 +335,7 @@
         <w:tc>
           <w:tcPr>
             <w:tcW w:type="dxa" w:w="2340"/>
-            <w:shd w:fill="1F4E79" w:val="clear"/>
+            <w:shd w:val="clear" w:color="auto" w:fill="FFFFFF"/>
           </w:tcPr>
           <w:p>
             <w:pPr>
@@ -341,7 +348,7 @@
                 <w:rFonts w:ascii="Times New Roman" w:hAnsi="Times New Roman" w:eastAsia="Times New Roman"/>
                 <w:b/>
                 <w:i w:val="0"/>
-                <w:color w:val="FFFFFF"/>
+                <w:color w:val="000000"/>
                 <w:sz w:val="18"/>
               </w:rPr>
               <w:t>Setup Details</w:t>
@@ -353,7 +360,7 @@
         <w:tc>
           <w:tcPr>
             <w:tcW w:type="dxa" w:w="2340"/>
-            <w:shd w:fill="FFFFFF" w:val="clear"/>
+            <w:shd w:val="clear" w:color="auto" w:fill="FFFFFF"/>
           </w:tcPr>
           <w:p>
             <w:pPr>
@@ -376,7 +383,7 @@
         <w:tc>
           <w:tcPr>
             <w:tcW w:type="dxa" w:w="2340"/>
-            <w:shd w:fill="FFFFFF" w:val="clear"/>
+            <w:shd w:val="clear" w:color="auto" w:fill="FFFFFF"/>
           </w:tcPr>
           <w:p>
             <w:pPr>
@@ -399,7 +406,7 @@
         <w:tc>
           <w:tcPr>
             <w:tcW w:type="dxa" w:w="2340"/>
-            <w:shd w:fill="FFFFFF" w:val="clear"/>
+            <w:shd w:val="clear" w:color="auto" w:fill="FFFFFF"/>
           </w:tcPr>
           <w:p>
             <w:pPr>
@@ -422,7 +429,7 @@
         <w:tc>
           <w:tcPr>
             <w:tcW w:type="dxa" w:w="2340"/>
-            <w:shd w:fill="FFFFFF" w:val="clear"/>
+            <w:shd w:val="clear" w:color="auto" w:fill="FFFFFF"/>
           </w:tcPr>
           <w:p>
             <w:pPr>
@@ -717,10 +724,17 @@
     </w:p>
     <w:tbl>
       <w:tblPr>
-        <w:tblStyle w:val="TableGrid"/>
         <w:tblW w:type="auto" w:w="0"/>
         <w:jc w:val="center"/>
-        <w:tblLook w:firstColumn="1" w:firstRow="1" w:lastColumn="0" w:lastRow="0" w:noHBand="0" w:noVBand="1" w:val="04A0"/>
+        <w:tblBorders>
+          <w:top w:val="single" w:sz="4" w:space="0" w:color="000000"/>
+          <w:left w:val="single" w:sz="4" w:space="0" w:color="000000"/>
+          <w:bottom w:val="single" w:sz="4" w:space="0" w:color="000000"/>
+          <w:right w:val="single" w:sz="4" w:space="0" w:color="000000"/>
+          <w:insideH w:val="single" w:sz="4" w:space="0" w:color="000000"/>
+          <w:insideV w:val="single" w:sz="4" w:space="0" w:color="000000"/>
+        </w:tblBorders>
+        <w:tblLook w:firstRow="0" w:lastRow="0" w:firstColumn="0" w:lastColumn="0" w:noHBand="1" w:noVBand="1"/>
       </w:tblPr>
       <w:tblGrid>
         <w:gridCol w:w="3120"/>
@@ -731,7 +745,7 @@
         <w:tc>
           <w:tcPr>
             <w:tcW w:type="dxa" w:w="3120"/>
-            <w:shd w:fill="1F4E79" w:val="clear"/>
+            <w:shd w:val="clear" w:color="auto" w:fill="FFFFFF"/>
           </w:tcPr>
           <w:p>
             <w:pPr>
@@ -744,7 +758,7 @@
                 <w:rFonts w:ascii="Times New Roman" w:hAnsi="Times New Roman" w:eastAsia="Times New Roman"/>
                 <w:b/>
                 <w:i w:val="0"/>
-                <w:color w:val="FFFFFF"/>
+                <w:color w:val="000000"/>
                 <w:sz w:val="18"/>
               </w:rPr>
               <w:t>Rating (out of 5)</w:t>
@@ -754,7 +768,7 @@
         <w:tc>
           <w:tcPr>
             <w:tcW w:type="dxa" w:w="3120"/>
-            <w:shd w:fill="1F4E79" w:val="clear"/>
+            <w:shd w:val="clear" w:color="auto" w:fill="FFFFFF"/>
           </w:tcPr>
           <w:p>
             <w:pPr>
@@ -767,7 +781,7 @@
                 <w:rFonts w:ascii="Times New Roman" w:hAnsi="Times New Roman" w:eastAsia="Times New Roman"/>
                 <w:b/>
                 <w:i w:val="0"/>
-                <w:color w:val="FFFFFF"/>
+                <w:color w:val="000000"/>
                 <w:sz w:val="18"/>
               </w:rPr>
               <w:t>No. of Respondents</w:t>
@@ -777,7 +791,7 @@
         <w:tc>
           <w:tcPr>
             <w:tcW w:type="dxa" w:w="3120"/>
-            <w:shd w:fill="1F4E79" w:val="clear"/>
+            <w:shd w:val="clear" w:color="auto" w:fill="FFFFFF"/>
           </w:tcPr>
           <w:p>
             <w:pPr>
@@ -790,7 +804,7 @@
                 <w:rFonts w:ascii="Times New Roman" w:hAnsi="Times New Roman" w:eastAsia="Times New Roman"/>
                 <w:b/>
                 <w:i w:val="0"/>
-                <w:color w:val="FFFFFF"/>
+                <w:color w:val="000000"/>
                 <w:sz w:val="18"/>
               </w:rPr>
               <w:t>Percentage (%)</w:t>
@@ -802,7 +816,7 @@
         <w:tc>
           <w:tcPr>
             <w:tcW w:type="dxa" w:w="3120"/>
-            <w:shd w:fill="FFFFFF" w:val="clear"/>
+            <w:shd w:val="clear" w:color="auto" w:fill="FFFFFF"/>
           </w:tcPr>
           <w:p>
             <w:pPr>
@@ -825,7 +839,7 @@
         <w:tc>
           <w:tcPr>
             <w:tcW w:type="dxa" w:w="3120"/>
-            <w:shd w:fill="FFFFFF" w:val="clear"/>
+            <w:shd w:val="clear" w:color="auto" w:fill="FFFFFF"/>
           </w:tcPr>
           <w:p>
             <w:pPr>
@@ -848,7 +862,7 @@
         <w:tc>
           <w:tcPr>
             <w:tcW w:type="dxa" w:w="3120"/>
-            <w:shd w:fill="FFFFFF" w:val="clear"/>
+            <w:shd w:val="clear" w:color="auto" w:fill="FFFFFF"/>
           </w:tcPr>
           <w:p>
             <w:pPr>
@@ -873,7 +887,7 @@
         <w:tc>
           <w:tcPr>
             <w:tcW w:type="dxa" w:w="3120"/>
-            <w:shd w:fill="F2F2F2" w:val="clear"/>
+            <w:shd w:val="clear" w:color="auto" w:fill="FFFFFF"/>
           </w:tcPr>
           <w:p>
             <w:pPr>
@@ -896,7 +910,7 @@
         <w:tc>
           <w:tcPr>
             <w:tcW w:type="dxa" w:w="3120"/>
-            <w:shd w:fill="F2F2F2" w:val="clear"/>
+            <w:shd w:val="clear" w:color="auto" w:fill="FFFFFF"/>
           </w:tcPr>
           <w:p>
             <w:pPr>
@@ -919,7 +933,7 @@
         <w:tc>
           <w:tcPr>
             <w:tcW w:type="dxa" w:w="3120"/>
-            <w:shd w:fill="F2F2F2" w:val="clear"/>
+            <w:shd w:val="clear" w:color="auto" w:fill="FFFFFF"/>
           </w:tcPr>
           <w:p>
             <w:pPr>
@@ -944,7 +958,7 @@
         <w:tc>
           <w:tcPr>
             <w:tcW w:type="dxa" w:w="3120"/>
-            <w:shd w:fill="FFFFFF" w:val="clear"/>
+            <w:shd w:val="clear" w:color="auto" w:fill="FFFFFF"/>
           </w:tcPr>
           <w:p>
             <w:pPr>
@@ -967,7 +981,7 @@
         <w:tc>
           <w:tcPr>
             <w:tcW w:type="dxa" w:w="3120"/>
-            <w:shd w:fill="FFFFFF" w:val="clear"/>
+            <w:shd w:val="clear" w:color="auto" w:fill="FFFFFF"/>
           </w:tcPr>
           <w:p>
             <w:pPr>
@@ -990,7 +1004,7 @@
         <w:tc>
           <w:tcPr>
             <w:tcW w:type="dxa" w:w="3120"/>
-            <w:shd w:fill="FFFFFF" w:val="clear"/>
+            <w:shd w:val="clear" w:color="auto" w:fill="FFFFFF"/>
           </w:tcPr>
           <w:p>
             <w:pPr>
@@ -1015,7 +1029,7 @@
         <w:tc>
           <w:tcPr>
             <w:tcW w:type="dxa" w:w="3120"/>
-            <w:shd w:fill="F2F2F2" w:val="clear"/>
+            <w:shd w:val="clear" w:color="auto" w:fill="FFFFFF"/>
           </w:tcPr>
           <w:p>
             <w:pPr>
@@ -1038,7 +1052,7 @@
         <w:tc>
           <w:tcPr>
             <w:tcW w:type="dxa" w:w="3120"/>
-            <w:shd w:fill="F2F2F2" w:val="clear"/>
+            <w:shd w:val="clear" w:color="auto" w:fill="FFFFFF"/>
           </w:tcPr>
           <w:p>
             <w:pPr>
@@ -1061,7 +1075,7 @@
         <w:tc>
           <w:tcPr>
             <w:tcW w:type="dxa" w:w="3120"/>
-            <w:shd w:fill="F2F2F2" w:val="clear"/>
+            <w:shd w:val="clear" w:color="auto" w:fill="FFFFFF"/>
           </w:tcPr>
           <w:p>
             <w:pPr>
@@ -1086,7 +1100,7 @@
         <w:tc>
           <w:tcPr>
             <w:tcW w:type="dxa" w:w="3120"/>
-            <w:shd w:fill="FFFFFF" w:val="clear"/>
+            <w:shd w:val="clear" w:color="auto" w:fill="FFFFFF"/>
           </w:tcPr>
           <w:p>
             <w:pPr>
@@ -1109,7 +1123,7 @@
         <w:tc>
           <w:tcPr>
             <w:tcW w:type="dxa" w:w="3120"/>
-            <w:shd w:fill="FFFFFF" w:val="clear"/>
+            <w:shd w:val="clear" w:color="auto" w:fill="FFFFFF"/>
           </w:tcPr>
           <w:p>
             <w:pPr>
@@ -1132,7 +1146,7 @@
         <w:tc>
           <w:tcPr>
             <w:tcW w:type="dxa" w:w="3120"/>
-            <w:shd w:fill="FFFFFF" w:val="clear"/>
+            <w:shd w:val="clear" w:color="auto" w:fill="FFFFFF"/>
           </w:tcPr>
           <w:p>
             <w:pPr>
@@ -1157,7 +1171,7 @@
         <w:tc>
           <w:tcPr>
             <w:tcW w:type="dxa" w:w="3120"/>
-            <w:shd w:fill="F2F2F2" w:val="clear"/>
+            <w:shd w:val="clear" w:color="auto" w:fill="FFFFFF"/>
           </w:tcPr>
           <w:p>
             <w:pPr>
@@ -1180,7 +1194,7 @@
         <w:tc>
           <w:tcPr>
             <w:tcW w:type="dxa" w:w="3120"/>
-            <w:shd w:fill="F2F2F2" w:val="clear"/>
+            <w:shd w:val="clear" w:color="auto" w:fill="FFFFFF"/>
           </w:tcPr>
           <w:p>
             <w:pPr>
@@ -1203,7 +1217,7 @@
         <w:tc>
           <w:tcPr>
             <w:tcW w:type="dxa" w:w="3120"/>
-            <w:shd w:fill="F2F2F2" w:val="clear"/>
+            <w:shd w:val="clear" w:color="auto" w:fill="FFFFFF"/>
           </w:tcPr>
           <w:p>
             <w:pPr>
@@ -1342,10 +1356,17 @@
     </w:p>
     <w:tbl>
       <w:tblPr>
-        <w:tblStyle w:val="TableGrid"/>
         <w:tblW w:type="auto" w:w="0"/>
         <w:jc w:val="center"/>
-        <w:tblLook w:firstColumn="1" w:firstRow="1" w:lastColumn="0" w:lastRow="0" w:noHBand="0" w:noVBand="1" w:val="04A0"/>
+        <w:tblBorders>
+          <w:top w:val="single" w:sz="4" w:space="0" w:color="000000"/>
+          <w:left w:val="single" w:sz="4" w:space="0" w:color="000000"/>
+          <w:bottom w:val="single" w:sz="4" w:space="0" w:color="000000"/>
+          <w:right w:val="single" w:sz="4" w:space="0" w:color="000000"/>
+          <w:insideH w:val="single" w:sz="4" w:space="0" w:color="000000"/>
+          <w:insideV w:val="single" w:sz="4" w:space="0" w:color="000000"/>
+        </w:tblBorders>
+        <w:tblLook w:firstRow="0" w:lastRow="0" w:firstColumn="0" w:lastColumn="0" w:noHBand="1" w:noVBand="1"/>
       </w:tblPr>
       <w:tblGrid>
         <w:gridCol w:w="2340"/>
@@ -1357,7 +1378,7 @@
         <w:tc>
           <w:tcPr>
             <w:tcW w:type="dxa" w:w="2340"/>
-            <w:shd w:fill="1F4E79" w:val="clear"/>
+            <w:shd w:val="clear" w:color="auto" w:fill="FFFFFF"/>
           </w:tcPr>
           <w:p>
             <w:pPr>
@@ -1370,7 +1391,7 @@
                 <w:rFonts w:ascii="Times New Roman" w:hAnsi="Times New Roman" w:eastAsia="Times New Roman"/>
                 <w:b/>
                 <w:i w:val="0"/>
-                <w:color w:val="FFFFFF"/>
+                <w:color w:val="000000"/>
                 <w:sz w:val="18"/>
               </w:rPr>
               <w:t>Indicator</w:t>
@@ -1380,7 +1401,7 @@
         <w:tc>
           <w:tcPr>
             <w:tcW w:type="dxa" w:w="2340"/>
-            <w:shd w:fill="1F4E79" w:val="clear"/>
+            <w:shd w:val="clear" w:color="auto" w:fill="FFFFFF"/>
           </w:tcPr>
           <w:p>
             <w:pPr>
@@ -1393,7 +1414,7 @@
                 <w:rFonts w:ascii="Times New Roman" w:hAnsi="Times New Roman" w:eastAsia="Times New Roman"/>
                 <w:b/>
                 <w:i w:val="0"/>
-                <w:color w:val="FFFFFF"/>
+                <w:color w:val="000000"/>
                 <w:sz w:val="18"/>
               </w:rPr>
               <w:t>Before Deployment</w:t>
@@ -1403,7 +1424,7 @@
         <w:tc>
           <w:tcPr>
             <w:tcW w:type="dxa" w:w="2340"/>
-            <w:shd w:fill="1F4E79" w:val="clear"/>
+            <w:shd w:val="clear" w:color="auto" w:fill="FFFFFF"/>
           </w:tcPr>
           <w:p>
             <w:pPr>
@@ -1416,7 +1437,7 @@
                 <w:rFonts w:ascii="Times New Roman" w:hAnsi="Times New Roman" w:eastAsia="Times New Roman"/>
                 <w:b/>
                 <w:i w:val="0"/>
-                <w:color w:val="FFFFFF"/>
+                <w:color w:val="000000"/>
                 <w:sz w:val="18"/>
               </w:rPr>
               <w:t>After Deployment</w:t>
@@ -1426,7 +1447,7 @@
         <w:tc>
           <w:tcPr>
             <w:tcW w:type="dxa" w:w="2340"/>
-            <w:shd w:fill="1F4E79" w:val="clear"/>
+            <w:shd w:val="clear" w:color="auto" w:fill="FFFFFF"/>
           </w:tcPr>
           <w:p>
             <w:pPr>
@@ -1439,7 +1460,7 @@
                 <w:rFonts w:ascii="Times New Roman" w:hAnsi="Times New Roman" w:eastAsia="Times New Roman"/>
                 <w:b/>
                 <w:i w:val="0"/>
-                <w:color w:val="FFFFFF"/>
+                <w:color w:val="000000"/>
                 <w:sz w:val="18"/>
               </w:rPr>
               <w:t>Change</w:t>
@@ -1451,7 +1472,7 @@
         <w:tc>
           <w:tcPr>
             <w:tcW w:type="dxa" w:w="2340"/>
-            <w:shd w:fill="FFFFFF" w:val="clear"/>
+            <w:shd w:val="clear" w:color="auto" w:fill="FFFFFF"/>
           </w:tcPr>
           <w:p>
             <w:pPr>
@@ -1474,7 +1495,7 @@
         <w:tc>
           <w:tcPr>
             <w:tcW w:type="dxa" w:w="2340"/>
-            <w:shd w:fill="FFFFFF" w:val="clear"/>
+            <w:shd w:val="clear" w:color="auto" w:fill="FFFFFF"/>
           </w:tcPr>
           <w:p>
             <w:pPr>
@@ -1497,7 +1518,7 @@
         <w:tc>
           <w:tcPr>
             <w:tcW w:type="dxa" w:w="2340"/>
-            <w:shd w:fill="FFFFFF" w:val="clear"/>
+            <w:shd w:val="clear" w:color="auto" w:fill="FFFFFF"/>
           </w:tcPr>
           <w:p>
             <w:pPr>
@@ -1520,7 +1541,7 @@
         <w:tc>
           <w:tcPr>
             <w:tcW w:type="dxa" w:w="2340"/>
-            <w:shd w:fill="FFFFFF" w:val="clear"/>
+            <w:shd w:val="clear" w:color="auto" w:fill="FFFFFF"/>
           </w:tcPr>
           <w:p>
             <w:pPr>
@@ -1545,7 +1566,7 @@
         <w:tc>
           <w:tcPr>
             <w:tcW w:type="dxa" w:w="2340"/>
-            <w:shd w:fill="F2F2F2" w:val="clear"/>
+            <w:shd w:val="clear" w:color="auto" w:fill="FFFFFF"/>
           </w:tcPr>
           <w:p>
             <w:pPr>
@@ -1568,7 +1589,7 @@
         <w:tc>
           <w:tcPr>
             <w:tcW w:type="dxa" w:w="2340"/>
-            <w:shd w:fill="F2F2F2" w:val="clear"/>
+            <w:shd w:val="clear" w:color="auto" w:fill="FFFFFF"/>
           </w:tcPr>
           <w:p>
             <w:pPr>
@@ -1591,7 +1612,7 @@
         <w:tc>
           <w:tcPr>
             <w:tcW w:type="dxa" w:w="2340"/>
-            <w:shd w:fill="F2F2F2" w:val="clear"/>
+            <w:shd w:val="clear" w:color="auto" w:fill="FFFFFF"/>
           </w:tcPr>
           <w:p>
             <w:pPr>
@@ -1614,7 +1635,7 @@
         <w:tc>
           <w:tcPr>
             <w:tcW w:type="dxa" w:w="2340"/>
-            <w:shd w:fill="F2F2F2" w:val="clear"/>
+            <w:shd w:val="clear" w:color="auto" w:fill="FFFFFF"/>
           </w:tcPr>
           <w:p>
             <w:pPr>
@@ -1639,7 +1660,7 @@
         <w:tc>
           <w:tcPr>
             <w:tcW w:type="dxa" w:w="2340"/>
-            <w:shd w:fill="FFFFFF" w:val="clear"/>
+            <w:shd w:val="clear" w:color="auto" w:fill="FFFFFF"/>
           </w:tcPr>
           <w:p>
             <w:pPr>
@@ -1662,7 +1683,7 @@
         <w:tc>
           <w:tcPr>
             <w:tcW w:type="dxa" w:w="2340"/>
-            <w:shd w:fill="FFFFFF" w:val="clear"/>
+            <w:shd w:val="clear" w:color="auto" w:fill="FFFFFF"/>
           </w:tcPr>
           <w:p>
             <w:pPr>
@@ -1685,7 +1706,7 @@
         <w:tc>
           <w:tcPr>
             <w:tcW w:type="dxa" w:w="2340"/>
-            <w:shd w:fill="FFFFFF" w:val="clear"/>
+            <w:shd w:val="clear" w:color="auto" w:fill="FFFFFF"/>
           </w:tcPr>
           <w:p>
             <w:pPr>
@@ -1708,7 +1729,7 @@
         <w:tc>
           <w:tcPr>
             <w:tcW w:type="dxa" w:w="2340"/>
-            <w:shd w:fill="FFFFFF" w:val="clear"/>
+            <w:shd w:val="clear" w:color="auto" w:fill="FFFFFF"/>
           </w:tcPr>
           <w:p>
             <w:pPr>
@@ -1733,7 +1754,7 @@
         <w:tc>
           <w:tcPr>
             <w:tcW w:type="dxa" w:w="2340"/>
-            <w:shd w:fill="F2F2F2" w:val="clear"/>
+            <w:shd w:val="clear" w:color="auto" w:fill="FFFFFF"/>
           </w:tcPr>
           <w:p>
             <w:pPr>
@@ -1756,7 +1777,7 @@
         <w:tc>
           <w:tcPr>
             <w:tcW w:type="dxa" w:w="2340"/>
-            <w:shd w:fill="F2F2F2" w:val="clear"/>
+            <w:shd w:val="clear" w:color="auto" w:fill="FFFFFF"/>
           </w:tcPr>
           <w:p>
             <w:pPr>
@@ -1779,7 +1800,7 @@
         <w:tc>
           <w:tcPr>
             <w:tcW w:type="dxa" w:w="2340"/>
-            <w:shd w:fill="F2F2F2" w:val="clear"/>
+            <w:shd w:val="clear" w:color="auto" w:fill="FFFFFF"/>
           </w:tcPr>
           <w:p>
             <w:pPr>
@@ -1802,7 +1823,7 @@
         <w:tc>
           <w:tcPr>
             <w:tcW w:type="dxa" w:w="2340"/>
-            <w:shd w:fill="F2F2F2" w:val="clear"/>
+            <w:shd w:val="clear" w:color="auto" w:fill="FFFFFF"/>
           </w:tcPr>
           <w:p>
             <w:pPr>
@@ -1827,7 +1848,7 @@
         <w:tc>
           <w:tcPr>
             <w:tcW w:type="dxa" w:w="2340"/>
-            <w:shd w:fill="FFFFFF" w:val="clear"/>
+            <w:shd w:val="clear" w:color="auto" w:fill="FFFFFF"/>
           </w:tcPr>
           <w:p>
             <w:pPr>
@@ -1850,7 +1871,7 @@
         <w:tc>
           <w:tcPr>
             <w:tcW w:type="dxa" w:w="2340"/>
-            <w:shd w:fill="FFFFFF" w:val="clear"/>
+            <w:shd w:val="clear" w:color="auto" w:fill="FFFFFF"/>
           </w:tcPr>
           <w:p>
             <w:pPr>
@@ -1873,7 +1894,7 @@
         <w:tc>
           <w:tcPr>
             <w:tcW w:type="dxa" w:w="2340"/>
-            <w:shd w:fill="FFFFFF" w:val="clear"/>
+            <w:shd w:val="clear" w:color="auto" w:fill="FFFFFF"/>
           </w:tcPr>
           <w:p>
             <w:pPr>
@@ -1896,7 +1917,7 @@
         <w:tc>
           <w:tcPr>
             <w:tcW w:type="dxa" w:w="2340"/>
-            <w:shd w:fill="FFFFFF" w:val="clear"/>
+            <w:shd w:val="clear" w:color="auto" w:fill="FFFFFF"/>
           </w:tcPr>
           <w:p>
             <w:pPr>
@@ -1981,10 +2002,17 @@
     </w:p>
     <w:tbl>
       <w:tblPr>
-        <w:tblStyle w:val="TableGrid"/>
         <w:tblW w:type="auto" w:w="0"/>
         <w:jc w:val="center"/>
-        <w:tblLook w:firstColumn="1" w:firstRow="1" w:lastColumn="0" w:lastRow="0" w:noHBand="0" w:noVBand="1" w:val="04A0"/>
+        <w:tblBorders>
+          <w:top w:val="single" w:sz="4" w:space="0" w:color="000000"/>
+          <w:left w:val="single" w:sz="4" w:space="0" w:color="000000"/>
+          <w:bottom w:val="single" w:sz="4" w:space="0" w:color="000000"/>
+          <w:right w:val="single" w:sz="4" w:space="0" w:color="000000"/>
+          <w:insideH w:val="single" w:sz="4" w:space="0" w:color="000000"/>
+          <w:insideV w:val="single" w:sz="4" w:space="0" w:color="000000"/>
+        </w:tblBorders>
+        <w:tblLook w:firstRow="0" w:lastRow="0" w:firstColumn="0" w:lastColumn="0" w:noHBand="1" w:noVBand="1"/>
       </w:tblPr>
       <w:tblGrid>
         <w:gridCol w:w="3120"/>
@@ -1995,7 +2023,7 @@
         <w:tc>
           <w:tcPr>
             <w:tcW w:type="dxa" w:w="3120"/>
-            <w:shd w:fill="1F4E79" w:val="clear"/>
+            <w:shd w:val="clear" w:color="auto" w:fill="FFFFFF"/>
           </w:tcPr>
           <w:p>
             <w:pPr>
@@ -2008,7 +2036,7 @@
                 <w:rFonts w:ascii="Times New Roman" w:hAnsi="Times New Roman" w:eastAsia="Times New Roman"/>
                 <w:b/>
                 <w:i w:val="0"/>
-                <w:color w:val="FFFFFF"/>
+                <w:color w:val="000000"/>
                 <w:sz w:val="18"/>
               </w:rPr>
               <w:t>Expected Outcome</w:t>
@@ -2018,7 +2046,7 @@
         <w:tc>
           <w:tcPr>
             <w:tcW w:type="dxa" w:w="3120"/>
-            <w:shd w:fill="1F4E79" w:val="clear"/>
+            <w:shd w:val="clear" w:color="auto" w:fill="FFFFFF"/>
           </w:tcPr>
           <w:p>
             <w:pPr>
@@ -2031,7 +2059,7 @@
                 <w:rFonts w:ascii="Times New Roman" w:hAnsi="Times New Roman" w:eastAsia="Times New Roman"/>
                 <w:b/>
                 <w:i w:val="0"/>
-                <w:color w:val="FFFFFF"/>
+                <w:color w:val="000000"/>
                 <w:sz w:val="18"/>
               </w:rPr>
               <w:t>Achieved?</w:t>
@@ -2041,7 +2069,7 @@
         <w:tc>
           <w:tcPr>
             <w:tcW w:type="dxa" w:w="3120"/>
-            <w:shd w:fill="1F4E79" w:val="clear"/>
+            <w:shd w:val="clear" w:color="auto" w:fill="FFFFFF"/>
           </w:tcPr>
           <w:p>
             <w:pPr>
@@ -2054,7 +2082,7 @@
                 <w:rFonts w:ascii="Times New Roman" w:hAnsi="Times New Roman" w:eastAsia="Times New Roman"/>
                 <w:b/>
                 <w:i w:val="0"/>
-                <w:color w:val="FFFFFF"/>
+                <w:color w:val="000000"/>
                 <w:sz w:val="18"/>
               </w:rPr>
               <w:t>Evidence</w:t>
@@ -2066,7 +2094,7 @@
         <w:tc>
           <w:tcPr>
             <w:tcW w:type="dxa" w:w="3120"/>
-            <w:shd w:fill="FFFFFF" w:val="clear"/>
+            <w:shd w:val="clear" w:color="auto" w:fill="FFFFFF"/>
           </w:tcPr>
           <w:p>
             <w:pPr>
@@ -2089,7 +2117,7 @@
         <w:tc>
           <w:tcPr>
             <w:tcW w:type="dxa" w:w="3120"/>
-            <w:shd w:fill="FFFFFF" w:val="clear"/>
+            <w:shd w:val="clear" w:color="auto" w:fill="FFFFFF"/>
           </w:tcPr>
           <w:p>
             <w:pPr>
@@ -2112,7 +2140,7 @@
         <w:tc>
           <w:tcPr>
             <w:tcW w:type="dxa" w:w="3120"/>
-            <w:shd w:fill="FFFFFF" w:val="clear"/>
+            <w:shd w:val="clear" w:color="auto" w:fill="FFFFFF"/>
           </w:tcPr>
           <w:p>
             <w:pPr>
@@ -2137,7 +2165,7 @@
         <w:tc>
           <w:tcPr>
             <w:tcW w:type="dxa" w:w="3120"/>
-            <w:shd w:fill="F2F2F2" w:val="clear"/>
+            <w:shd w:val="clear" w:color="auto" w:fill="FFFFFF"/>
           </w:tcPr>
           <w:p>
             <w:pPr>
@@ -2160,7 +2188,7 @@
         <w:tc>
           <w:tcPr>
             <w:tcW w:type="dxa" w:w="3120"/>
-            <w:shd w:fill="F2F2F2" w:val="clear"/>
+            <w:shd w:val="clear" w:color="auto" w:fill="FFFFFF"/>
           </w:tcPr>
           <w:p>
             <w:pPr>
@@ -2183,7 +2211,7 @@
         <w:tc>
           <w:tcPr>
             <w:tcW w:type="dxa" w:w="3120"/>
-            <w:shd w:fill="F2F2F2" w:val="clear"/>
+            <w:shd w:val="clear" w:color="auto" w:fill="FFFFFF"/>
           </w:tcPr>
           <w:p>
             <w:pPr>
@@ -2208,7 +2236,7 @@
         <w:tc>
           <w:tcPr>
             <w:tcW w:type="dxa" w:w="3120"/>
-            <w:shd w:fill="FFFFFF" w:val="clear"/>
+            <w:shd w:val="clear" w:color="auto" w:fill="FFFFFF"/>
           </w:tcPr>
           <w:p>
             <w:pPr>
@@ -2231,7 +2259,7 @@
         <w:tc>
           <w:tcPr>
             <w:tcW w:type="dxa" w:w="3120"/>
-            <w:shd w:fill="FFFFFF" w:val="clear"/>
+            <w:shd w:val="clear" w:color="auto" w:fill="FFFFFF"/>
           </w:tcPr>
           <w:p>
             <w:pPr>
@@ -2254,7 +2282,7 @@
         <w:tc>
           <w:tcPr>
             <w:tcW w:type="dxa" w:w="3120"/>
-            <w:shd w:fill="FFFFFF" w:val="clear"/>
+            <w:shd w:val="clear" w:color="auto" w:fill="FFFFFF"/>
           </w:tcPr>
           <w:p>
             <w:pPr>
@@ -2279,7 +2307,7 @@
         <w:tc>
           <w:tcPr>
             <w:tcW w:type="dxa" w:w="3120"/>
-            <w:shd w:fill="F2F2F2" w:val="clear"/>
+            <w:shd w:val="clear" w:color="auto" w:fill="FFFFFF"/>
           </w:tcPr>
           <w:p>
             <w:pPr>
@@ -2302,7 +2330,7 @@
         <w:tc>
           <w:tcPr>
             <w:tcW w:type="dxa" w:w="3120"/>
-            <w:shd w:fill="F2F2F2" w:val="clear"/>
+            <w:shd w:val="clear" w:color="auto" w:fill="FFFFFF"/>
           </w:tcPr>
           <w:p>
             <w:pPr>
@@ -2325,7 +2353,7 @@
         <w:tc>
           <w:tcPr>
             <w:tcW w:type="dxa" w:w="3120"/>
-            <w:shd w:fill="F2F2F2" w:val="clear"/>
+            <w:shd w:val="clear" w:color="auto" w:fill="FFFFFF"/>
           </w:tcPr>
           <w:p>
             <w:pPr>
@@ -2350,7 +2378,7 @@
         <w:tc>
           <w:tcPr>
             <w:tcW w:type="dxa" w:w="3120"/>
-            <w:shd w:fill="FFFFFF" w:val="clear"/>
+            <w:shd w:val="clear" w:color="auto" w:fill="FFFFFF"/>
           </w:tcPr>
           <w:p>
             <w:pPr>
@@ -2373,7 +2401,7 @@
         <w:tc>
           <w:tcPr>
             <w:tcW w:type="dxa" w:w="3120"/>
-            <w:shd w:fill="FFFFFF" w:val="clear"/>
+            <w:shd w:val="clear" w:color="auto" w:fill="FFFFFF"/>
           </w:tcPr>
           <w:p>
             <w:pPr>
@@ -2396,7 +2424,7 @@
         <w:tc>
           <w:tcPr>
             <w:tcW w:type="dxa" w:w="3120"/>
-            <w:shd w:fill="FFFFFF" w:val="clear"/>
+            <w:shd w:val="clear" w:color="auto" w:fill="FFFFFF"/>
           </w:tcPr>
           <w:p>
             <w:pPr>
@@ -2421,7 +2449,7 @@
         <w:tc>
           <w:tcPr>
             <w:tcW w:type="dxa" w:w="3120"/>
-            <w:shd w:fill="F2F2F2" w:val="clear"/>
+            <w:shd w:val="clear" w:color="auto" w:fill="FFFFFF"/>
           </w:tcPr>
           <w:p>
             <w:pPr>
@@ -2444,7 +2472,7 @@
         <w:tc>
           <w:tcPr>
             <w:tcW w:type="dxa" w:w="3120"/>
-            <w:shd w:fill="F2F2F2" w:val="clear"/>
+            <w:shd w:val="clear" w:color="auto" w:fill="FFFFFF"/>
           </w:tcPr>
           <w:p>
             <w:pPr>
@@ -2467,7 +2495,7 @@
         <w:tc>
           <w:tcPr>
             <w:tcW w:type="dxa" w:w="3120"/>
-            <w:shd w:fill="F2F2F2" w:val="clear"/>
+            <w:shd w:val="clear" w:color="auto" w:fill="FFFFFF"/>
           </w:tcPr>
           <w:p>
             <w:pPr>

</xml_diff>